<commit_message>
Kafka consumer lag monitoring
</commit_message>
<xml_diff>
--- a/microserviceArchitechture.docx
+++ b/microserviceArchitechture.docx
@@ -81,7 +81,23 @@
           <w:b/>
           <w:bCs/>
         </w:rPr>
-        <w:t>Why server.port=8761?</w:t>
+        <w:t xml:space="preserve">Why </w:t>
+      </w:r>
+      <w:proofErr w:type="spellStart"/>
+      <w:r>
+        <w:rPr>
+          <w:b/>
+          <w:bCs/>
+        </w:rPr>
+        <w:t>server.port</w:t>
+      </w:r>
+      <w:proofErr w:type="spellEnd"/>
+      <w:r>
+        <w:rPr>
+          <w:b/>
+          <w:bCs/>
+        </w:rPr>
+        <w:t>=8761?</w:t>
       </w:r>
     </w:p>
     <w:p>
@@ -152,8 +168,13 @@
       <w:pPr>
         <w:pStyle w:val="NoSpacing"/>
       </w:pPr>
-      <w:r>
-        <w:t>eureka.server.enable-self-preservation=true</w:t>
+      <w:proofErr w:type="spellStart"/>
+      <w:r>
+        <w:t>eureka.server.enable</w:t>
+      </w:r>
+      <w:proofErr w:type="spellEnd"/>
+      <w:r>
+        <w:t>-self-preservation=true</w:t>
       </w:r>
     </w:p>
     <w:p>
@@ -219,7 +240,23 @@
           <w:b/>
           <w:bCs/>
         </w:rPr>
-        <w:t>Spring WebFlux internally</w:t>
+        <w:t xml:space="preserve">Spring </w:t>
+      </w:r>
+      <w:proofErr w:type="spellStart"/>
+      <w:r>
+        <w:rPr>
+          <w:b/>
+          <w:bCs/>
+        </w:rPr>
+        <w:t>WebFlux</w:t>
+      </w:r>
+      <w:proofErr w:type="spellEnd"/>
+      <w:r>
+        <w:rPr>
+          <w:b/>
+          <w:bCs/>
+        </w:rPr>
+        <w:t xml:space="preserve"> internally</w:t>
       </w:r>
       <w:r>
         <w:t>.</w:t>
@@ -272,7 +309,15 @@
         <w:pStyle w:val="NoSpacing"/>
       </w:pPr>
       <w:r>
-        <w:t>When you run api-gateway, console should show:</w:t>
+        <w:t xml:space="preserve">When you run </w:t>
+      </w:r>
+      <w:proofErr w:type="spellStart"/>
+      <w:r>
+        <w:t>api</w:t>
+      </w:r>
+      <w:proofErr w:type="spellEnd"/>
+      <w:r>
+        <w:t>-gateway, console should show:</w:t>
       </w:r>
     </w:p>
     <w:p>
@@ -348,8 +393,13 @@
         </w:numPr>
       </w:pPr>
       <w:r>
-        <w:t>Spring WebFlux</w:t>
-      </w:r>
+        <w:t xml:space="preserve">Spring </w:t>
+      </w:r>
+      <w:proofErr w:type="spellStart"/>
+      <w:r>
+        <w:t>WebFlux</w:t>
+      </w:r>
+      <w:proofErr w:type="spellEnd"/>
     </w:p>
     <w:p>
       <w:pPr>
@@ -534,16 +584,13 @@
         <w:pStyle w:val="NoSpacing"/>
       </w:pPr>
       <w:r>
-        <w:t>docker ps</w:t>
-      </w:r>
-    </w:p>
-    <w:p>
-      <w:pPr>
-        <w:pStyle w:val="NoSpacing"/>
-      </w:pPr>
-      <w:r>
-        <w:t>docker restart kafka</w:t>
-      </w:r>
+        <w:t xml:space="preserve">docker </w:t>
+      </w:r>
+      <w:proofErr w:type="spellStart"/>
+      <w:r>
+        <w:t>ps</w:t>
+      </w:r>
+      <w:proofErr w:type="spellEnd"/>
     </w:p>
     <w:p>
       <w:pPr>
@@ -552,6 +599,19 @@
       <w:r>
         <w:t xml:space="preserve">docker restart </w:t>
       </w:r>
+      <w:proofErr w:type="spellStart"/>
+      <w:r>
+        <w:t>kafka</w:t>
+      </w:r>
+      <w:proofErr w:type="spellEnd"/>
+    </w:p>
+    <w:p>
+      <w:pPr>
+        <w:pStyle w:val="NoSpacing"/>
+      </w:pPr>
+      <w:r>
+        <w:t xml:space="preserve">docker restart </w:t>
+      </w:r>
       <w:r>
         <w:t>zookeeper</w:t>
       </w:r>
@@ -560,34 +620,208 @@
       <w:pPr>
         <w:pStyle w:val="NoSpacing"/>
       </w:pPr>
-    </w:p>
-    <w:p>
-      <w:pPr>
-        <w:pStyle w:val="NoSpacing"/>
-      </w:pPr>
-      <w:r>
-        <w:t>docker exec -it kafka kafka-topics --list --bootstrap-server localhost:9092</w:t>
-      </w:r>
-    </w:p>
-    <w:p>
-      <w:pPr>
-        <w:pStyle w:val="NoSpacing"/>
-      </w:pPr>
-    </w:p>
-    <w:p>
-      <w:pPr>
-        <w:pStyle w:val="NoSpacing"/>
-      </w:pPr>
-    </w:p>
-    <w:p>
-      <w:pPr>
-        <w:pStyle w:val="NoSpacing"/>
-      </w:pPr>
-    </w:p>
-    <w:p>
-      <w:pPr>
-        <w:pStyle w:val="NoSpacing"/>
-      </w:pPr>
+      <w:r>
+        <w:t xml:space="preserve">docker restart </w:t>
+      </w:r>
+      <w:proofErr w:type="spellStart"/>
+      <w:r>
+        <w:t>redis</w:t>
+      </w:r>
+      <w:proofErr w:type="spellEnd"/>
+    </w:p>
+    <w:p>
+      <w:pPr>
+        <w:pStyle w:val="NoSpacing"/>
+      </w:pPr>
+      <w:r>
+        <w:t xml:space="preserve">docker restart </w:t>
+      </w:r>
+      <w:r>
+        <w:t xml:space="preserve"> </w:t>
+      </w:r>
+      <w:r>
+        <w:t>Prometheus</w:t>
+      </w:r>
+    </w:p>
+    <w:p>
+      <w:pPr>
+        <w:pStyle w:val="NoSpacing"/>
+      </w:pPr>
+      <w:r>
+        <w:t xml:space="preserve">docker exec -it </w:t>
+      </w:r>
+      <w:proofErr w:type="spellStart"/>
+      <w:r>
+        <w:t>kafka</w:t>
+      </w:r>
+      <w:proofErr w:type="spellEnd"/>
+      <w:r>
+        <w:t xml:space="preserve"> </w:t>
+      </w:r>
+      <w:proofErr w:type="spellStart"/>
+      <w:r>
+        <w:t>kafka</w:t>
+      </w:r>
+      <w:proofErr w:type="spellEnd"/>
+      <w:r>
+        <w:t>-topics --list --bootstrap-server localhost:9092</w:t>
+      </w:r>
+    </w:p>
+    <w:p>
+      <w:pPr>
+        <w:pStyle w:val="NoSpacing"/>
+      </w:pPr>
+    </w:p>
+    <w:p>
+      <w:pPr>
+        <w:pStyle w:val="NoSpacing"/>
+      </w:pPr>
+      <w:r>
+        <w:t xml:space="preserve">docker run -d -p 3000:3000 </w:t>
+      </w:r>
+      <w:proofErr w:type="spellStart"/>
+      <w:r>
+        <w:t>grafana</w:t>
+      </w:r>
+      <w:proofErr w:type="spellEnd"/>
+      <w:r>
+        <w:t>/</w:t>
+      </w:r>
+      <w:proofErr w:type="spellStart"/>
+      <w:r>
+        <w:t>grafana</w:t>
+      </w:r>
+      <w:proofErr w:type="spellEnd"/>
+    </w:p>
+    <w:p>
+      <w:pPr>
+        <w:pStyle w:val="NoSpacing"/>
+      </w:pPr>
+      <w:r>
+        <w:t xml:space="preserve">docker run -d -p 6379:6379 </w:t>
+      </w:r>
+      <w:proofErr w:type="spellStart"/>
+      <w:r>
+        <w:t>redis</w:t>
+      </w:r>
+      <w:proofErr w:type="spellEnd"/>
+    </w:p>
+    <w:p>
+      <w:pPr>
+        <w:pStyle w:val="NoSpacing"/>
+      </w:pPr>
+      <w:r>
+        <w:t>docker run -d -p 9090:9090 prom/</w:t>
+      </w:r>
+      <w:r>
+        <w:t>Prometheus</w:t>
+      </w:r>
+    </w:p>
+    <w:p>
+      <w:pPr>
+        <w:pStyle w:val="NoSpacing"/>
+      </w:pPr>
+    </w:p>
+    <w:p>
+      <w:pPr>
+        <w:pStyle w:val="NoSpacing"/>
+      </w:pPr>
+      <w:r>
+        <w:t xml:space="preserve">docker run -d -p 9308:9308 </w:t>
+      </w:r>
+      <w:proofErr w:type="spellStart"/>
+      <w:r>
+        <w:t>danielqsj</w:t>
+      </w:r>
+      <w:proofErr w:type="spellEnd"/>
+      <w:r>
+        <w:t>/</w:t>
+      </w:r>
+      <w:proofErr w:type="spellStart"/>
+      <w:r>
+        <w:t>kafka</w:t>
+      </w:r>
+      <w:proofErr w:type="spellEnd"/>
+      <w:r>
+        <w:t>-exporter --</w:t>
+      </w:r>
+      <w:proofErr w:type="spellStart"/>
+      <w:r>
+        <w:t>kafka.server</w:t>
+      </w:r>
+      <w:proofErr w:type="spellEnd"/>
+      <w:r>
+        <w:t>=localhost:9092</w:t>
+      </w:r>
+    </w:p>
+    <w:p>
+      <w:pPr>
+        <w:pStyle w:val="NoSpacing"/>
+      </w:pPr>
+    </w:p>
+    <w:p>
+      <w:pPr>
+        <w:pStyle w:val="NoSpacing"/>
+      </w:pPr>
+      <w:r>
+        <w:t xml:space="preserve">docker run -d --name </w:t>
+      </w:r>
+      <w:proofErr w:type="spellStart"/>
+      <w:r>
+        <w:t>kafka</w:t>
+      </w:r>
+      <w:proofErr w:type="spellEnd"/>
+      <w:r>
+        <w:t xml:space="preserve">-exporter -p 9308:9308 </w:t>
+      </w:r>
+      <w:proofErr w:type="spellStart"/>
+      <w:r>
+        <w:t>danielqsj</w:t>
+      </w:r>
+      <w:proofErr w:type="spellEnd"/>
+      <w:r>
+        <w:t>/</w:t>
+      </w:r>
+      <w:proofErr w:type="spellStart"/>
+      <w:r>
+        <w:t>kafka</w:t>
+      </w:r>
+      <w:proofErr w:type="spellEnd"/>
+      <w:r>
+        <w:t>-exporter --</w:t>
+      </w:r>
+      <w:proofErr w:type="spellStart"/>
+      <w:r>
+        <w:t>kafka.server</w:t>
+      </w:r>
+      <w:proofErr w:type="spellEnd"/>
+      <w:r>
+        <w:t>=host.docker.internal:9092</w:t>
+      </w:r>
+    </w:p>
+    <w:p>
+      <w:pPr>
+        <w:pStyle w:val="NoSpacing"/>
+      </w:pPr>
+    </w:p>
+    <w:p>
+      <w:pPr>
+        <w:pStyle w:val="NoSpacing"/>
+      </w:pPr>
+      <w:r>
+        <w:t xml:space="preserve">docker run -d -p 9090:9090 -v </w:t>
+      </w:r>
+      <w:r>
+        <w:t>C:\Vikas\study\e-commerece-app</w:t>
+      </w:r>
+      <w:r>
+        <w:t>\prometheus.yml:/etc/prometheus/prometheus.yml prom/</w:t>
+      </w:r>
+      <w:proofErr w:type="spellStart"/>
+      <w:r>
+        <w:t>prometheus</w:t>
+      </w:r>
+      <w:proofErr w:type="spellEnd"/>
     </w:p>
     <w:p>
       <w:pPr>
@@ -612,81 +846,160 @@
         <w:pStyle w:val="NoSpacing"/>
       </w:pPr>
       <w:r>
-        <w:t>docker run -d --name kafka -p 9092:9092 -e KAFKA_ZOOKEEPER_CONNECT=host.docker.internal:2181 -e KAFKA_ADVERTISED_LISTENERS=PLAINTEXT://localhost:9092 -e KAFKA_OFFSETS_TOPIC_REPLICATION_FACTOR=1 confluentinc/cp-kafka</w:t>
-      </w:r>
-    </w:p>
-    <w:p>
-      <w:pPr>
-        <w:pStyle w:val="NoSpacing"/>
-      </w:pPr>
-    </w:p>
-    <w:p>
-      <w:pPr>
-        <w:pStyle w:val="NoSpacing"/>
-      </w:pPr>
-      <w:r>
-        <w:t>netstat -ano | findstr 9092</w:t>
-      </w:r>
-    </w:p>
-    <w:p>
-      <w:pPr>
-        <w:pStyle w:val="NoSpacing"/>
-      </w:pPr>
-      <w:r>
-        <w:t>docker rm -f kafka zookeeper</w:t>
-      </w:r>
-    </w:p>
-    <w:p>
-      <w:pPr>
-        <w:pStyle w:val="NoSpacing"/>
-      </w:pPr>
-    </w:p>
-    <w:p>
-      <w:pPr>
-        <w:pStyle w:val="NoSpacing"/>
-      </w:pPr>
-      <w:r>
-        <w:t>docker run -d --name zookeeper -p 2181:2181 -e ZOOKEEPER_CLIENT_PORT=2181 -e ZOOKEEPER_TICK_TIME=2000 confluentinc/cp-zookeeper:7.5.0</w:t>
-      </w:r>
-    </w:p>
-    <w:p>
-      <w:pPr>
-        <w:pStyle w:val="NoSpacing"/>
-      </w:pPr>
-    </w:p>
-    <w:p>
-      <w:pPr>
-        <w:pStyle w:val="NoSpacing"/>
-      </w:pPr>
-      <w:r>
-        <w:t>docker run -d --name kafka -p 9092:9092 -e KAFKA_BROKER_ID=1 -e KAFKA_ZOOKEEPER_CONNECT=host.docker.internal:2181 -e KAFKA_ADVERTISED_LISTENERS=PLAINTEXT://localhost:9092 -e KAFKA_OFFSETS_TOPIC_REPLICATION_FACTOR=1 confluentinc/cp-kafka:7.5.0</w:t>
-      </w:r>
-    </w:p>
-    <w:p>
-      <w:pPr>
-        <w:pStyle w:val="NoSpacing"/>
-      </w:pPr>
-    </w:p>
-    <w:p>
-      <w:pPr>
-        <w:pStyle w:val="NoSpacing"/>
-      </w:pPr>
-      <w:r>
-        <w:t>docker ps</w:t>
-      </w:r>
-    </w:p>
-    <w:p>
-      <w:pPr>
-        <w:pStyle w:val="NoSpacing"/>
-      </w:pPr>
-    </w:p>
-    <w:p>
-      <w:pPr>
-        <w:pStyle w:val="NoSpacing"/>
-      </w:pPr>
-      <w:r>
-        <w:t>docker stop kafka</w:t>
-      </w:r>
+        <w:t xml:space="preserve">docker run -d --name </w:t>
+      </w:r>
+      <w:proofErr w:type="spellStart"/>
+      <w:r>
+        <w:t>kafka</w:t>
+      </w:r>
+      <w:proofErr w:type="spellEnd"/>
+      <w:r>
+        <w:t xml:space="preserve"> -p 9092:9092 -e KAFKA_ZOOKEEPER_CONNECT=host.docker.internal:2181 -e KAFKA_ADVERTISED_LISTENERS=PLAINTEXT://localhost:9092 -e KAFKA_OFFSETS_TOPIC_REPLICATION_FACTOR=1 </w:t>
+      </w:r>
+      <w:proofErr w:type="spellStart"/>
+      <w:r>
+        <w:t>confluentinc</w:t>
+      </w:r>
+      <w:proofErr w:type="spellEnd"/>
+      <w:r>
+        <w:t>/cp-</w:t>
+      </w:r>
+      <w:proofErr w:type="spellStart"/>
+      <w:r>
+        <w:t>kafka</w:t>
+      </w:r>
+      <w:proofErr w:type="spellEnd"/>
+    </w:p>
+    <w:p>
+      <w:pPr>
+        <w:pStyle w:val="NoSpacing"/>
+      </w:pPr>
+    </w:p>
+    <w:p>
+      <w:pPr>
+        <w:pStyle w:val="NoSpacing"/>
+      </w:pPr>
+      <w:r>
+        <w:t>netstat -</w:t>
+      </w:r>
+      <w:proofErr w:type="spellStart"/>
+      <w:r>
+        <w:t>ano</w:t>
+      </w:r>
+      <w:proofErr w:type="spellEnd"/>
+      <w:r>
+        <w:t xml:space="preserve"> | </w:t>
+      </w:r>
+      <w:proofErr w:type="spellStart"/>
+      <w:r>
+        <w:t>findstr</w:t>
+      </w:r>
+      <w:proofErr w:type="spellEnd"/>
+      <w:r>
+        <w:t xml:space="preserve"> 9092</w:t>
+      </w:r>
+    </w:p>
+    <w:p>
+      <w:pPr>
+        <w:pStyle w:val="NoSpacing"/>
+      </w:pPr>
+      <w:r>
+        <w:t xml:space="preserve">docker rm -f </w:t>
+      </w:r>
+      <w:proofErr w:type="spellStart"/>
+      <w:r>
+        <w:t>kafka</w:t>
+      </w:r>
+      <w:proofErr w:type="spellEnd"/>
+      <w:r>
+        <w:t xml:space="preserve"> zookeeper</w:t>
+      </w:r>
+    </w:p>
+    <w:p>
+      <w:pPr>
+        <w:pStyle w:val="NoSpacing"/>
+      </w:pPr>
+    </w:p>
+    <w:p>
+      <w:pPr>
+        <w:pStyle w:val="NoSpacing"/>
+      </w:pPr>
+      <w:r>
+        <w:t xml:space="preserve">docker run -d --name zookeeper -p 2181:2181 -e ZOOKEEPER_CLIENT_PORT=2181 -e ZOOKEEPER_TICK_TIME=2000 </w:t>
+      </w:r>
+      <w:proofErr w:type="spellStart"/>
+      <w:r>
+        <w:t>confluentinc</w:t>
+      </w:r>
+      <w:proofErr w:type="spellEnd"/>
+      <w:r>
+        <w:t>/cp-zookeeper:7.5.0</w:t>
+      </w:r>
+    </w:p>
+    <w:p>
+      <w:pPr>
+        <w:pStyle w:val="NoSpacing"/>
+      </w:pPr>
+    </w:p>
+    <w:p>
+      <w:pPr>
+        <w:pStyle w:val="NoSpacing"/>
+      </w:pPr>
+      <w:r>
+        <w:t xml:space="preserve">docker run -d --name </w:t>
+      </w:r>
+      <w:proofErr w:type="spellStart"/>
+      <w:r>
+        <w:t>kafka</w:t>
+      </w:r>
+      <w:proofErr w:type="spellEnd"/>
+      <w:r>
+        <w:t xml:space="preserve"> -p 9092:9092 -e KAFKA_BROKER_ID=1 -e KAFKA_ZOOKEEPER_CONNECT=host.docker.internal:2181 -e KAFKA_ADVERTISED_LISTENERS=PLAINTEXT://localhost:9092 -e KAFKA_OFFSETS_TOPIC_REPLICATION_FACTOR=1 </w:t>
+      </w:r>
+      <w:proofErr w:type="spellStart"/>
+      <w:r>
+        <w:t>confluentinc</w:t>
+      </w:r>
+      <w:proofErr w:type="spellEnd"/>
+      <w:r>
+        <w:t>/cp-kafka:7.5.0</w:t>
+      </w:r>
+    </w:p>
+    <w:p>
+      <w:pPr>
+        <w:pStyle w:val="NoSpacing"/>
+      </w:pPr>
+    </w:p>
+    <w:p>
+      <w:pPr>
+        <w:pStyle w:val="NoSpacing"/>
+      </w:pPr>
+      <w:r>
+        <w:t xml:space="preserve">docker </w:t>
+      </w:r>
+      <w:proofErr w:type="spellStart"/>
+      <w:r>
+        <w:t>ps</w:t>
+      </w:r>
+      <w:proofErr w:type="spellEnd"/>
+    </w:p>
+    <w:p>
+      <w:pPr>
+        <w:pStyle w:val="NoSpacing"/>
+      </w:pPr>
+    </w:p>
+    <w:p>
+      <w:pPr>
+        <w:pStyle w:val="NoSpacing"/>
+      </w:pPr>
+      <w:r>
+        <w:t xml:space="preserve">docker stop </w:t>
+      </w:r>
+      <w:proofErr w:type="spellStart"/>
+      <w:r>
+        <w:t>kafka</w:t>
+      </w:r>
+      <w:proofErr w:type="spellEnd"/>
     </w:p>
     <w:p>
       <w:pPr>
@@ -701,8 +1014,14 @@
         <w:pStyle w:val="NoSpacing"/>
       </w:pPr>
       <w:r>
-        <w:t>docker rm kafka</w:t>
-      </w:r>
+        <w:lastRenderedPageBreak/>
+        <w:t xml:space="preserve">docker rm </w:t>
+      </w:r>
+      <w:proofErr w:type="spellStart"/>
+      <w:r>
+        <w:t>kafka</w:t>
+      </w:r>
+      <w:proofErr w:type="spellEnd"/>
     </w:p>
     <w:p>
       <w:pPr>
@@ -740,7 +1059,15 @@
         <w:pStyle w:val="NoSpacing"/>
       </w:pPr>
       <w:r>
-        <w:t>docker volume rm &lt;volume_name&gt;</w:t>
+        <w:t>docker volume rm &lt;</w:t>
+      </w:r>
+      <w:proofErr w:type="spellStart"/>
+      <w:r>
+        <w:t>volume_name</w:t>
+      </w:r>
+      <w:proofErr w:type="spellEnd"/>
+      <w:r>
+        <w:t>&gt;</w:t>
       </w:r>
     </w:p>
     <w:p>
@@ -771,65 +1098,105 @@
         <w:pStyle w:val="NoSpacing"/>
       </w:pPr>
       <w:r>
-        <w:t>docker run -d --name zookeeper -p 2181:2181 -e ZOOKEEPER_CLIENT_PORT=2181 -e ZOOKEEPER_TICK_TIME=2000 confluentinc/cp-zookeeper:7.5.0</w:t>
-      </w:r>
-    </w:p>
-    <w:p>
-      <w:pPr>
-        <w:pStyle w:val="NoSpacing"/>
-      </w:pPr>
-    </w:p>
-    <w:p>
-      <w:pPr>
-        <w:pStyle w:val="NoSpacing"/>
-      </w:pPr>
-    </w:p>
-    <w:p>
-      <w:pPr>
-        <w:pStyle w:val="NoSpacing"/>
-      </w:pPr>
-      <w:r>
-        <w:t>docker run -d --name kafka -p 9092:9092 -e KAFKA_BROKER_ID=1 -e KAFKA_ZOOKEEPER_CONNECT=host.docker.internal:2181 -e KAFKA_ADVERTISED_LISTENERS=PLAINTEXT://localhost:9092 -e KAFKA_OFFSETS_TOPIC_REPLICATION_FACTOR=1 confluentinc/cp-kafka:7.5.0</w:t>
-      </w:r>
-    </w:p>
-    <w:p>
-      <w:pPr>
-        <w:pStyle w:val="NoSpacing"/>
-      </w:pPr>
-    </w:p>
-    <w:p>
-      <w:pPr>
-        <w:pStyle w:val="NoSpacing"/>
-      </w:pPr>
-      <w:r>
-        <w:t>netstat -ano | findstr 9092</w:t>
-      </w:r>
-    </w:p>
-    <w:p>
-      <w:pPr>
-        <w:pStyle w:val="NoSpacing"/>
-      </w:pPr>
-    </w:p>
-    <w:p>
-      <w:pPr>
-        <w:pStyle w:val="NoSpacing"/>
-      </w:pPr>
-      <w:r>
-        <w:t>docker exec -it kafka bash</w:t>
-      </w:r>
-    </w:p>
-    <w:p>
-      <w:pPr>
-        <w:pStyle w:val="NoSpacing"/>
-      </w:pPr>
-    </w:p>
-    <w:p>
-      <w:pPr>
-        <w:pStyle w:val="NoSpacing"/>
-      </w:pPr>
-      <w:r>
-        <w:t>docker restart kafka</w:t>
-      </w:r>
+        <w:t xml:space="preserve">docker run -d --name zookeeper -p 2181:2181 -e ZOOKEEPER_CLIENT_PORT=2181 -e ZOOKEEPER_TICK_TIME=2000 </w:t>
+      </w:r>
+      <w:proofErr w:type="spellStart"/>
+      <w:r>
+        <w:t>confluentinc</w:t>
+      </w:r>
+      <w:proofErr w:type="spellEnd"/>
+      <w:r>
+        <w:t>/cp-zookeeper:7.5.0</w:t>
+      </w:r>
+    </w:p>
+    <w:p>
+      <w:pPr>
+        <w:pStyle w:val="NoSpacing"/>
+      </w:pPr>
+    </w:p>
+    <w:p>
+      <w:pPr>
+        <w:pStyle w:val="NoSpacing"/>
+      </w:pPr>
+    </w:p>
+    <w:p>
+      <w:pPr>
+        <w:pStyle w:val="NoSpacing"/>
+      </w:pPr>
+      <w:r>
+        <w:t xml:space="preserve">docker run -d --name </w:t>
+      </w:r>
+      <w:proofErr w:type="spellStart"/>
+      <w:r>
+        <w:t>kafka</w:t>
+      </w:r>
+      <w:proofErr w:type="spellEnd"/>
+      <w:r>
+        <w:t xml:space="preserve"> -p 9092:9092 -e KAFKA_BROKER_ID=1 -e KAFKA_ZOOKEEPER_CONNECT=host.docker.internal:2181 -e KAFKA_ADVERTISED_LISTENERS=PLAINTEXT://localhost:9092 -e KAFKA_OFFSETS_TOPIC_REPLICATION_FACTOR=1 </w:t>
+      </w:r>
+      <w:proofErr w:type="spellStart"/>
+      <w:r>
+        <w:t>confluentinc</w:t>
+      </w:r>
+      <w:proofErr w:type="spellEnd"/>
+      <w:r>
+        <w:t>/cp-kafka:7.5.0</w:t>
+      </w:r>
+    </w:p>
+    <w:p>
+      <w:pPr>
+        <w:pStyle w:val="NoSpacing"/>
+      </w:pPr>
+    </w:p>
+    <w:p>
+      <w:pPr>
+        <w:pStyle w:val="NoSpacing"/>
+      </w:pPr>
+      <w:r>
+        <w:t>netstat -</w:t>
+      </w:r>
+      <w:proofErr w:type="spellStart"/>
+      <w:r>
+        <w:t>ano</w:t>
+      </w:r>
+      <w:proofErr w:type="spellEnd"/>
+      <w:r>
+        <w:t xml:space="preserve"> | </w:t>
+      </w:r>
+      <w:proofErr w:type="spellStart"/>
+      <w:r>
+        <w:t>findstr</w:t>
+      </w:r>
+      <w:proofErr w:type="spellEnd"/>
+      <w:r>
+        <w:t xml:space="preserve"> 9092</w:t>
+      </w:r>
+    </w:p>
+    <w:p>
+      <w:pPr>
+        <w:pStyle w:val="NoSpacing"/>
+      </w:pPr>
+    </w:p>
+    <w:p>
+      <w:pPr>
+        <w:pStyle w:val="NoSpacing"/>
+      </w:pPr>
+      <w:r>
+        <w:t xml:space="preserve">docker exec -it </w:t>
+      </w:r>
+      <w:proofErr w:type="spellStart"/>
+      <w:r>
+        <w:t>kafka</w:t>
+      </w:r>
+      <w:proofErr w:type="spellEnd"/>
+      <w:r>
+        <w:t xml:space="preserve"> bash</w:t>
+      </w:r>
+    </w:p>
+    <w:p>
+      <w:pPr>
+        <w:pStyle w:val="NoSpacing"/>
+      </w:pPr>
     </w:p>
     <w:p>
       <w:pPr>
@@ -838,6 +1205,19 @@
       <w:r>
         <w:t xml:space="preserve">docker restart </w:t>
       </w:r>
+      <w:proofErr w:type="spellStart"/>
+      <w:r>
+        <w:t>kafka</w:t>
+      </w:r>
+      <w:proofErr w:type="spellEnd"/>
+    </w:p>
+    <w:p>
+      <w:pPr>
+        <w:pStyle w:val="NoSpacing"/>
+      </w:pPr>
+      <w:r>
+        <w:t xml:space="preserve">docker restart </w:t>
+      </w:r>
       <w:r>
         <w:t>zookeeper</w:t>
       </w:r>
@@ -852,33 +1232,81 @@
         <w:pStyle w:val="NoSpacing"/>
       </w:pPr>
       <w:r>
-        <w:t>docker exec -it kafka kafka-topics --delete --topic product-topic --bootstrap-server localhost:9092</w:t>
-      </w:r>
-    </w:p>
-    <w:p>
-      <w:pPr>
-        <w:pStyle w:val="NoSpacing"/>
-      </w:pPr>
-    </w:p>
-    <w:p>
-      <w:pPr>
-        <w:pStyle w:val="NoSpacing"/>
-      </w:pPr>
-      <w:r>
-        <w:t>docker exec -it kafka kafka-topics --create --topic order-topic --bootstrap-server localhost:9092 --replication-factor 1 --partitions 1</w:t>
-      </w:r>
-    </w:p>
-    <w:p>
-      <w:pPr>
-        <w:pStyle w:val="NoSpacing"/>
-      </w:pPr>
-    </w:p>
-    <w:p>
-      <w:pPr>
-        <w:pStyle w:val="NoSpacing"/>
-      </w:pPr>
-      <w:r>
-        <w:t>docker exec -it kafka kafka-topics --list --bootstrap-server localhost:9092</w:t>
+        <w:t xml:space="preserve">docker exec -it </w:t>
+      </w:r>
+      <w:proofErr w:type="spellStart"/>
+      <w:r>
+        <w:t>kafka</w:t>
+      </w:r>
+      <w:proofErr w:type="spellEnd"/>
+      <w:r>
+        <w:t xml:space="preserve"> </w:t>
+      </w:r>
+      <w:proofErr w:type="spellStart"/>
+      <w:r>
+        <w:t>kafka</w:t>
+      </w:r>
+      <w:proofErr w:type="spellEnd"/>
+      <w:r>
+        <w:t>-topics --delete --topic product-topic --bootstrap-server localhost:9092</w:t>
+      </w:r>
+    </w:p>
+    <w:p>
+      <w:pPr>
+        <w:pStyle w:val="NoSpacing"/>
+      </w:pPr>
+    </w:p>
+    <w:p>
+      <w:pPr>
+        <w:pStyle w:val="NoSpacing"/>
+      </w:pPr>
+      <w:r>
+        <w:t xml:space="preserve">docker exec -it </w:t>
+      </w:r>
+      <w:proofErr w:type="spellStart"/>
+      <w:r>
+        <w:t>kafka</w:t>
+      </w:r>
+      <w:proofErr w:type="spellEnd"/>
+      <w:r>
+        <w:t xml:space="preserve"> </w:t>
+      </w:r>
+      <w:proofErr w:type="spellStart"/>
+      <w:r>
+        <w:t>kafka</w:t>
+      </w:r>
+      <w:proofErr w:type="spellEnd"/>
+      <w:r>
+        <w:t>-topics --create --topic order-topic --bootstrap-server localhost:9092 --replication-factor 1 --partitions 1</w:t>
+      </w:r>
+    </w:p>
+    <w:p>
+      <w:pPr>
+        <w:pStyle w:val="NoSpacing"/>
+      </w:pPr>
+    </w:p>
+    <w:p>
+      <w:pPr>
+        <w:pStyle w:val="NoSpacing"/>
+      </w:pPr>
+      <w:r>
+        <w:t xml:space="preserve">docker exec -it </w:t>
+      </w:r>
+      <w:proofErr w:type="spellStart"/>
+      <w:r>
+        <w:t>kafka</w:t>
+      </w:r>
+      <w:proofErr w:type="spellEnd"/>
+      <w:r>
+        <w:t xml:space="preserve"> </w:t>
+      </w:r>
+      <w:proofErr w:type="spellStart"/>
+      <w:r>
+        <w:t>kafka</w:t>
+      </w:r>
+      <w:proofErr w:type="spellEnd"/>
+      <w:r>
+        <w:t>-topics --list --bootstrap-server localhost:9092</w:t>
       </w:r>
     </w:p>
     <w:p>
@@ -924,33 +1352,73 @@
         <w:t xml:space="preserve"> </w:t>
       </w:r>
       <w:r>
-        <w:t>--topic payment-topic --bootstrap-server localhost:9092 --property print.partition=true</w:t>
-      </w:r>
-    </w:p>
-    <w:p>
-      <w:pPr>
-        <w:pStyle w:val="NoSpacing"/>
-      </w:pPr>
-    </w:p>
-    <w:p>
-      <w:pPr>
-        <w:pStyle w:val="NoSpacing"/>
-      </w:pPr>
-      <w:r>
-        <w:t>docker exec -it kafka kafka-topics --create --topic order-topic --bootstrap-server localhost:9092 --replication-factor 1 --partitions 1</w:t>
-      </w:r>
-    </w:p>
-    <w:p>
-      <w:pPr>
-        <w:pStyle w:val="NoSpacing"/>
-      </w:pPr>
-    </w:p>
-    <w:p>
-      <w:pPr>
-        <w:pStyle w:val="NoSpacing"/>
-      </w:pPr>
-      <w:r>
-        <w:t xml:space="preserve">docker exec -it kafka kafka-topics --create --topic </w:t>
+        <w:t xml:space="preserve">--topic payment-topic --bootstrap-server localhost:9092 --property </w:t>
+      </w:r>
+      <w:proofErr w:type="spellStart"/>
+      <w:r>
+        <w:t>print.partition</w:t>
+      </w:r>
+      <w:proofErr w:type="spellEnd"/>
+      <w:r>
+        <w:t>=true</w:t>
+      </w:r>
+    </w:p>
+    <w:p>
+      <w:pPr>
+        <w:pStyle w:val="NoSpacing"/>
+      </w:pPr>
+    </w:p>
+    <w:p>
+      <w:pPr>
+        <w:pStyle w:val="NoSpacing"/>
+      </w:pPr>
+      <w:r>
+        <w:t xml:space="preserve">docker exec -it </w:t>
+      </w:r>
+      <w:proofErr w:type="spellStart"/>
+      <w:r>
+        <w:t>kafka</w:t>
+      </w:r>
+      <w:proofErr w:type="spellEnd"/>
+      <w:r>
+        <w:t xml:space="preserve"> </w:t>
+      </w:r>
+      <w:proofErr w:type="spellStart"/>
+      <w:r>
+        <w:t>kafka</w:t>
+      </w:r>
+      <w:proofErr w:type="spellEnd"/>
+      <w:r>
+        <w:t>-topics --create --topic order-topic --bootstrap-server localhost:9092 --replication-factor 1 --partitions 1</w:t>
+      </w:r>
+    </w:p>
+    <w:p>
+      <w:pPr>
+        <w:pStyle w:val="NoSpacing"/>
+      </w:pPr>
+    </w:p>
+    <w:p>
+      <w:pPr>
+        <w:pStyle w:val="NoSpacing"/>
+      </w:pPr>
+      <w:r>
+        <w:t xml:space="preserve">docker exec -it </w:t>
+      </w:r>
+      <w:proofErr w:type="spellStart"/>
+      <w:r>
+        <w:t>kafka</w:t>
+      </w:r>
+      <w:proofErr w:type="spellEnd"/>
+      <w:r>
+        <w:t xml:space="preserve"> </w:t>
+      </w:r>
+      <w:proofErr w:type="spellStart"/>
+      <w:r>
+        <w:t>kafka</w:t>
+      </w:r>
+      <w:proofErr w:type="spellEnd"/>
+      <w:r>
+        <w:t xml:space="preserve">-topics --create --topic </w:t>
       </w:r>
       <w:r>
         <w:t>product-topic</w:t>
@@ -972,188 +1440,404 @@
         <w:pStyle w:val="NoSpacing"/>
       </w:pPr>
       <w:r>
-        <w:t>docker exec -it kafka kafka-topics --create --topic inventory-topic --bootstrap-server localhost:9092 --partitions 1 --replication-factor 1</w:t>
-      </w:r>
-    </w:p>
-    <w:p>
-      <w:pPr>
-        <w:pStyle w:val="NoSpacing"/>
-      </w:pPr>
-    </w:p>
-    <w:p>
-      <w:pPr>
-        <w:pStyle w:val="NoSpacing"/>
-      </w:pPr>
-      <w:r>
-        <w:t>docker exec -it kafka kafka-topics --create --topic inventory-topic-dlt --bootstrap-server localhost:9092 --partitions 1 --replication-factor 1</w:t>
-      </w:r>
-    </w:p>
-    <w:p>
-      <w:pPr>
-        <w:pStyle w:val="NoSpacing"/>
-      </w:pPr>
-    </w:p>
-    <w:p>
-      <w:pPr>
-        <w:pStyle w:val="NoSpacing"/>
-      </w:pPr>
-      <w:r>
-        <w:t>docker exec -it kafka kafka-topics --create --topic order-topic-dlt --bootstrap-server localhost:9092 --partitions 1 --replication-factor 1</w:t>
-      </w:r>
-    </w:p>
-    <w:p>
-      <w:pPr>
-        <w:pStyle w:val="NoSpacing"/>
-      </w:pPr>
-    </w:p>
-    <w:p>
-      <w:pPr>
-        <w:pStyle w:val="NoSpacing"/>
-      </w:pPr>
-      <w:r>
-        <w:t>docker exec -it kafka kafka-consumer-groups --bootstrap-server localhost:9092 --group inventory-group --topic order-topic --reset-offsets --to-latest --execute</w:t>
-      </w:r>
-    </w:p>
-    <w:p>
-      <w:pPr>
-        <w:pStyle w:val="NoSpacing"/>
-      </w:pPr>
-    </w:p>
-    <w:p>
-      <w:pPr>
-        <w:pStyle w:val="NoSpacing"/>
-      </w:pPr>
-      <w:r>
-        <w:t>docker exec -it kafka kafka-consumer-groups --bootstrap-server localhost:9092 --describe --group inventory-group</w:t>
-      </w:r>
-    </w:p>
-    <w:p>
-      <w:pPr>
-        <w:pStyle w:val="NoSpacing"/>
-      </w:pPr>
-    </w:p>
-    <w:p>
-      <w:pPr>
-        <w:pStyle w:val="NoSpacing"/>
-      </w:pPr>
-      <w:r>
-        <w:t>docker exec -it kafka kafka-consumer-groups --bootstrap-server localhost:9092 --group inventory-group --topic order-topic --reset-offsets --to-latest --execute</w:t>
-      </w:r>
-    </w:p>
-    <w:p>
-      <w:pPr>
-        <w:pStyle w:val="NoSpacing"/>
-      </w:pPr>
-    </w:p>
-    <w:p>
-      <w:pPr>
-        <w:pStyle w:val="NoSpacing"/>
-      </w:pPr>
-    </w:p>
-    <w:p>
-      <w:pPr>
-        <w:pStyle w:val="NoSpacing"/>
-      </w:pPr>
-      <w:r>
-        <w:t>docker exec -it kafka kafka-consumer-groups --bootstrap-server localhost:9092 --delete --group inventory-group</w:t>
-      </w:r>
-    </w:p>
-    <w:p>
-      <w:pPr>
-        <w:pStyle w:val="NoSpacing"/>
-      </w:pPr>
-    </w:p>
-    <w:p>
-      <w:pPr>
-        <w:pStyle w:val="NoSpacing"/>
-      </w:pPr>
-      <w:r>
-        <w:t>docker exec -it kafka kafka-topics --describe --topic payment-topic --bootstrap-server localhost:9092</w:t>
-      </w:r>
-    </w:p>
-    <w:p>
-      <w:pPr>
-        <w:pStyle w:val="NoSpacing"/>
-      </w:pPr>
-    </w:p>
-    <w:p>
-      <w:pPr>
-        <w:pStyle w:val="NoSpacing"/>
-      </w:pPr>
-      <w:r>
-        <w:t>docker exec -it kafka kafka-consumer-groups --bootstrap-server localhost:9092 --describe --group payment-group</w:t>
-      </w:r>
-    </w:p>
-    <w:p>
-      <w:pPr>
-        <w:pStyle w:val="NoSpacing"/>
-      </w:pPr>
-    </w:p>
-    <w:p>
-      <w:pPr>
-        <w:pStyle w:val="NoSpacing"/>
-      </w:pPr>
-      <w:r>
-        <w:t>docker exec -it kafka kafka-consumer-groups --bootstrap-server localhost:9092 --group order-group --topic payment-response-topic --reset-offsets --to-latest --execute</w:t>
-      </w:r>
-    </w:p>
-    <w:p>
-      <w:pPr>
-        <w:pStyle w:val="NoSpacing"/>
-      </w:pPr>
-    </w:p>
-    <w:p>
-      <w:pPr>
-        <w:pStyle w:val="NoSpacing"/>
-      </w:pPr>
-      <w:r>
-        <w:t>docker exec -it kafka kafka-consumer-groups --bootstrap-server localhost:9092 --group order-group --topic payment-response-topic --reset-offsets --to-latest --execute</w:t>
-      </w:r>
-    </w:p>
-    <w:p>
-      <w:pPr>
-        <w:pStyle w:val="NoSpacing"/>
-      </w:pPr>
-    </w:p>
-    <w:p>
-      <w:pPr>
-        <w:pStyle w:val="NoSpacing"/>
-      </w:pPr>
-    </w:p>
-    <w:p>
-      <w:pPr>
-        <w:pStyle w:val="NoSpacing"/>
-      </w:pPr>
-    </w:p>
-    <w:p>
-      <w:pPr>
-        <w:pStyle w:val="NoSpacing"/>
-      </w:pPr>
-      <w:r>
-        <w:t>docker run -d --name zookeeper  -p 2181:2181   -e ZOOKEEPER_CLIENT_PORT=2181   confluentinc/cp-zookeeper:7.5.0</w:t>
-      </w:r>
-    </w:p>
-    <w:p>
-      <w:pPr>
-        <w:pStyle w:val="NoSpacing"/>
-      </w:pPr>
-    </w:p>
-    <w:p>
-      <w:pPr>
-        <w:pStyle w:val="NoSpacing"/>
-      </w:pPr>
-    </w:p>
-    <w:p>
-      <w:pPr>
-        <w:pStyle w:val="NoSpacing"/>
-      </w:pPr>
-    </w:p>
-    <w:p>
-      <w:pPr>
-        <w:pStyle w:val="NoSpacing"/>
-      </w:pPr>
-      <w:r>
-        <w:t xml:space="preserve">docker exec -it kafka kafka-topics --delete --topic </w:t>
+        <w:t xml:space="preserve">docker exec -it </w:t>
+      </w:r>
+      <w:proofErr w:type="spellStart"/>
+      <w:r>
+        <w:t>kafka</w:t>
+      </w:r>
+      <w:proofErr w:type="spellEnd"/>
+      <w:r>
+        <w:t xml:space="preserve"> </w:t>
+      </w:r>
+      <w:proofErr w:type="spellStart"/>
+      <w:r>
+        <w:t>kafka</w:t>
+      </w:r>
+      <w:proofErr w:type="spellEnd"/>
+      <w:r>
+        <w:t>-topics --create --topic inventory-topic --bootstrap-server localhost:9092 --partitions 1 --replication-factor 1</w:t>
+      </w:r>
+    </w:p>
+    <w:p>
+      <w:pPr>
+        <w:pStyle w:val="NoSpacing"/>
+      </w:pPr>
+    </w:p>
+    <w:p>
+      <w:pPr>
+        <w:pStyle w:val="NoSpacing"/>
+      </w:pPr>
+      <w:r>
+        <w:t xml:space="preserve">docker exec -it </w:t>
+      </w:r>
+      <w:proofErr w:type="spellStart"/>
+      <w:r>
+        <w:t>kafka</w:t>
+      </w:r>
+      <w:proofErr w:type="spellEnd"/>
+      <w:r>
+        <w:t xml:space="preserve"> </w:t>
+      </w:r>
+      <w:proofErr w:type="spellStart"/>
+      <w:r>
+        <w:t>kafka</w:t>
+      </w:r>
+      <w:proofErr w:type="spellEnd"/>
+      <w:r>
+        <w:t>-topics --create --topic inventory-topic-</w:t>
+      </w:r>
+      <w:proofErr w:type="spellStart"/>
+      <w:r>
+        <w:t>dlt</w:t>
+      </w:r>
+      <w:proofErr w:type="spellEnd"/>
+      <w:r>
+        <w:t xml:space="preserve"> --bootstrap-server localhost:9092 --partitions 1 --replication-factor 1</w:t>
+      </w:r>
+    </w:p>
+    <w:p>
+      <w:pPr>
+        <w:pStyle w:val="NoSpacing"/>
+      </w:pPr>
+    </w:p>
+    <w:p>
+      <w:pPr>
+        <w:pStyle w:val="NoSpacing"/>
+      </w:pPr>
+      <w:r>
+        <w:t xml:space="preserve">docker exec -it </w:t>
+      </w:r>
+      <w:proofErr w:type="spellStart"/>
+      <w:r>
+        <w:t>kafka</w:t>
+      </w:r>
+      <w:proofErr w:type="spellEnd"/>
+      <w:r>
+        <w:t xml:space="preserve"> </w:t>
+      </w:r>
+      <w:proofErr w:type="spellStart"/>
+      <w:r>
+        <w:t>kafka</w:t>
+      </w:r>
+      <w:proofErr w:type="spellEnd"/>
+      <w:r>
+        <w:t>-topics --create --topic order-topic-</w:t>
+      </w:r>
+      <w:proofErr w:type="spellStart"/>
+      <w:r>
+        <w:t>dlt</w:t>
+      </w:r>
+      <w:proofErr w:type="spellEnd"/>
+      <w:r>
+        <w:t xml:space="preserve"> --bootstrap-server localhost:9092 --partitions 1 --replication-factor 1</w:t>
+      </w:r>
+    </w:p>
+    <w:p>
+      <w:pPr>
+        <w:pStyle w:val="NoSpacing"/>
+      </w:pPr>
+    </w:p>
+    <w:p>
+      <w:pPr>
+        <w:pStyle w:val="NoSpacing"/>
+      </w:pPr>
+      <w:r>
+        <w:t xml:space="preserve">docker exec -it </w:t>
+      </w:r>
+      <w:proofErr w:type="spellStart"/>
+      <w:r>
+        <w:t>kafka</w:t>
+      </w:r>
+      <w:proofErr w:type="spellEnd"/>
+      <w:r>
+        <w:t xml:space="preserve"> </w:t>
+      </w:r>
+      <w:proofErr w:type="spellStart"/>
+      <w:r>
+        <w:t>kafka</w:t>
+      </w:r>
+      <w:proofErr w:type="spellEnd"/>
+      <w:r>
+        <w:t>-consumer-groups --bootstrap-server localhost:9092 --group inventory-group --topic order-topic --reset-offsets --to-latest --execute</w:t>
+      </w:r>
+    </w:p>
+    <w:p>
+      <w:pPr>
+        <w:pStyle w:val="NoSpacing"/>
+      </w:pPr>
+    </w:p>
+    <w:p>
+      <w:pPr>
+        <w:pStyle w:val="NoSpacing"/>
+      </w:pPr>
+      <w:r>
+        <w:t xml:space="preserve">docker exec -it </w:t>
+      </w:r>
+      <w:proofErr w:type="spellStart"/>
+      <w:r>
+        <w:t>kafka</w:t>
+      </w:r>
+      <w:proofErr w:type="spellEnd"/>
+      <w:r>
+        <w:t xml:space="preserve"> </w:t>
+      </w:r>
+      <w:proofErr w:type="spellStart"/>
+      <w:r>
+        <w:t>kafka</w:t>
+      </w:r>
+      <w:proofErr w:type="spellEnd"/>
+      <w:r>
+        <w:t>-consumer-groups --bootstrap-server localhost:9092 --describe --group inventory-group</w:t>
+      </w:r>
+    </w:p>
+    <w:p>
+      <w:pPr>
+        <w:pStyle w:val="NoSpacing"/>
+      </w:pPr>
+    </w:p>
+    <w:p>
+      <w:pPr>
+        <w:pStyle w:val="NoSpacing"/>
+      </w:pPr>
+      <w:r>
+        <w:t xml:space="preserve">docker exec -it </w:t>
+      </w:r>
+      <w:proofErr w:type="spellStart"/>
+      <w:r>
+        <w:t>kafka</w:t>
+      </w:r>
+      <w:proofErr w:type="spellEnd"/>
+      <w:r>
+        <w:t xml:space="preserve"> </w:t>
+      </w:r>
+      <w:proofErr w:type="spellStart"/>
+      <w:r>
+        <w:t>kafka</w:t>
+      </w:r>
+      <w:proofErr w:type="spellEnd"/>
+      <w:r>
+        <w:t>-consumer-groups --bootstrap-server localhost:9092 --group inventory-group --topic order-topic --reset-offsets --to-latest --execute</w:t>
+      </w:r>
+    </w:p>
+    <w:p>
+      <w:pPr>
+        <w:pStyle w:val="NoSpacing"/>
+      </w:pPr>
+    </w:p>
+    <w:p>
+      <w:pPr>
+        <w:pStyle w:val="NoSpacing"/>
+      </w:pPr>
+    </w:p>
+    <w:p>
+      <w:pPr>
+        <w:pStyle w:val="NoSpacing"/>
+      </w:pPr>
+      <w:r>
+        <w:t xml:space="preserve">docker exec -it </w:t>
+      </w:r>
+      <w:proofErr w:type="spellStart"/>
+      <w:r>
+        <w:t>kafka</w:t>
+      </w:r>
+      <w:proofErr w:type="spellEnd"/>
+      <w:r>
+        <w:t xml:space="preserve"> </w:t>
+      </w:r>
+      <w:proofErr w:type="spellStart"/>
+      <w:r>
+        <w:t>kafka</w:t>
+      </w:r>
+      <w:proofErr w:type="spellEnd"/>
+      <w:r>
+        <w:t>-consumer-groups --bootstrap-server localhost:9092 --delete --group inventory-group</w:t>
+      </w:r>
+    </w:p>
+    <w:p>
+      <w:pPr>
+        <w:pStyle w:val="NoSpacing"/>
+      </w:pPr>
+    </w:p>
+    <w:p>
+      <w:pPr>
+        <w:pStyle w:val="NoSpacing"/>
+      </w:pPr>
+      <w:r>
+        <w:t xml:space="preserve">docker exec -it </w:t>
+      </w:r>
+      <w:proofErr w:type="spellStart"/>
+      <w:r>
+        <w:t>kafka</w:t>
+      </w:r>
+      <w:proofErr w:type="spellEnd"/>
+      <w:r>
+        <w:t xml:space="preserve"> </w:t>
+      </w:r>
+      <w:proofErr w:type="spellStart"/>
+      <w:r>
+        <w:t>kafka</w:t>
+      </w:r>
+      <w:proofErr w:type="spellEnd"/>
+      <w:r>
+        <w:t>-topics --describe --topic payment-topic --bootstrap-server localhost:9092</w:t>
+      </w:r>
+    </w:p>
+    <w:p>
+      <w:pPr>
+        <w:pStyle w:val="NoSpacing"/>
+      </w:pPr>
+    </w:p>
+    <w:p>
+      <w:pPr>
+        <w:pStyle w:val="NoSpacing"/>
+      </w:pPr>
+      <w:r>
+        <w:t xml:space="preserve">docker exec -it </w:t>
+      </w:r>
+      <w:proofErr w:type="spellStart"/>
+      <w:r>
+        <w:t>kafka</w:t>
+      </w:r>
+      <w:proofErr w:type="spellEnd"/>
+      <w:r>
+        <w:t xml:space="preserve"> </w:t>
+      </w:r>
+      <w:proofErr w:type="spellStart"/>
+      <w:r>
+        <w:t>kafka</w:t>
+      </w:r>
+      <w:proofErr w:type="spellEnd"/>
+      <w:r>
+        <w:t>-consumer-groups --bootstrap-server localhost:9092 --describe --group payment-group</w:t>
+      </w:r>
+    </w:p>
+    <w:p>
+      <w:pPr>
+        <w:pStyle w:val="NoSpacing"/>
+      </w:pPr>
+    </w:p>
+    <w:p>
+      <w:pPr>
+        <w:pStyle w:val="NoSpacing"/>
+      </w:pPr>
+      <w:r>
+        <w:t xml:space="preserve">docker exec -it </w:t>
+      </w:r>
+      <w:proofErr w:type="spellStart"/>
+      <w:r>
+        <w:t>kafka</w:t>
+      </w:r>
+      <w:proofErr w:type="spellEnd"/>
+      <w:r>
+        <w:t xml:space="preserve"> </w:t>
+      </w:r>
+      <w:proofErr w:type="spellStart"/>
+      <w:r>
+        <w:t>kafka</w:t>
+      </w:r>
+      <w:proofErr w:type="spellEnd"/>
+      <w:r>
+        <w:t>-consumer-groups --bootstrap-server localhost:9092 --group order-group --topic payment-response-topic --reset-offsets --to-latest --execute</w:t>
+      </w:r>
+    </w:p>
+    <w:p>
+      <w:pPr>
+        <w:pStyle w:val="NoSpacing"/>
+      </w:pPr>
+    </w:p>
+    <w:p>
+      <w:pPr>
+        <w:pStyle w:val="NoSpacing"/>
+      </w:pPr>
+      <w:r>
+        <w:t xml:space="preserve">docker exec -it </w:t>
+      </w:r>
+      <w:proofErr w:type="spellStart"/>
+      <w:r>
+        <w:t>kafka</w:t>
+      </w:r>
+      <w:proofErr w:type="spellEnd"/>
+      <w:r>
+        <w:t xml:space="preserve"> </w:t>
+      </w:r>
+      <w:proofErr w:type="spellStart"/>
+      <w:r>
+        <w:t>kafka</w:t>
+      </w:r>
+      <w:proofErr w:type="spellEnd"/>
+      <w:r>
+        <w:t>-consumer-groups --bootstrap-server localhost:9092 --group order-group --topic payment-response-topic --reset-offsets --to-latest --execute</w:t>
+      </w:r>
+    </w:p>
+    <w:p>
+      <w:pPr>
+        <w:pStyle w:val="NoSpacing"/>
+      </w:pPr>
+    </w:p>
+    <w:p>
+      <w:pPr>
+        <w:pStyle w:val="NoSpacing"/>
+      </w:pPr>
+    </w:p>
+    <w:p>
+      <w:pPr>
+        <w:pStyle w:val="NoSpacing"/>
+      </w:pPr>
+    </w:p>
+    <w:p>
+      <w:pPr>
+        <w:pStyle w:val="NoSpacing"/>
+      </w:pPr>
+      <w:r>
+        <w:t xml:space="preserve">docker run -d --name zookeeper  -p 2181:2181   -e ZOOKEEPER_CLIENT_PORT=2181   </w:t>
+      </w:r>
+      <w:proofErr w:type="spellStart"/>
+      <w:r>
+        <w:t>confluentinc</w:t>
+      </w:r>
+      <w:proofErr w:type="spellEnd"/>
+      <w:r>
+        <w:t>/cp-zookeeper:7.5.0</w:t>
+      </w:r>
+    </w:p>
+    <w:p>
+      <w:pPr>
+        <w:pStyle w:val="NoSpacing"/>
+      </w:pPr>
+    </w:p>
+    <w:p>
+      <w:pPr>
+        <w:pStyle w:val="NoSpacing"/>
+      </w:pPr>
+    </w:p>
+    <w:p>
+      <w:pPr>
+        <w:pStyle w:val="NoSpacing"/>
+      </w:pPr>
+    </w:p>
+    <w:p>
+      <w:pPr>
+        <w:pStyle w:val="NoSpacing"/>
+      </w:pPr>
+      <w:r>
+        <w:t xml:space="preserve">docker exec -it </w:t>
+      </w:r>
+      <w:proofErr w:type="spellStart"/>
+      <w:r>
+        <w:t>kafka</w:t>
+      </w:r>
+      <w:proofErr w:type="spellEnd"/>
+      <w:r>
+        <w:t xml:space="preserve"> </w:t>
+      </w:r>
+      <w:proofErr w:type="spellStart"/>
+      <w:r>
+        <w:t>kafka</w:t>
+      </w:r>
+      <w:proofErr w:type="spellEnd"/>
+      <w:r>
+        <w:t xml:space="preserve">-topics --delete --topic </w:t>
       </w:r>
       <w:r>
         <w:t>inventory-topic</w:t>
@@ -1170,47 +1854,31 @@
         <w:pStyle w:val="NoSpacing"/>
       </w:pPr>
       <w:r>
-        <w:t>docker exec -it kafka kafka-topics --delete --topic inventory-topic-dlt --bootstrap-server localhost:9092</w:t>
-      </w:r>
-    </w:p>
-    <w:p>
-      <w:pPr>
-        <w:pStyle w:val="NoSpacing"/>
-      </w:pPr>
-      <w:r>
-        <w:t>docker exec -it kafka kafka-topics --delete --topic order-topic --bootstrap-server localhost:9092</w:t>
-      </w:r>
-    </w:p>
-    <w:p>
-      <w:pPr>
-        <w:pStyle w:val="NoSpacing"/>
-      </w:pPr>
-      <w:r>
-        <w:t>docker exec -it kafka kafka-topics --delete --topic order-topic-dlt --bootstrap-server localhost:9092</w:t>
-      </w:r>
-    </w:p>
-    <w:p>
-      <w:pPr>
-        <w:pStyle w:val="NoSpacing"/>
-      </w:pPr>
-      <w:r>
-        <w:t>docker exec -it kafka kafka-topics --delete --topic order-topic-retry-0 --bootstrap-server localhost:9092</w:t>
-      </w:r>
-    </w:p>
-    <w:p>
-      <w:pPr>
-        <w:pStyle w:val="NoSpacing"/>
-      </w:pPr>
-      <w:r>
-        <w:t>docker exec -it kafka kafka-topics --delete --topic order-topic-retry-1 --bootstrap-server localhost:9092</w:t>
-      </w:r>
-    </w:p>
-    <w:p>
-      <w:pPr>
-        <w:pStyle w:val="NoSpacing"/>
-      </w:pPr>
-      <w:r>
-        <w:t>docker exec -it kafka kafka-topics --delete --topic payment-response-topic --bootstrap-server localhost:9092</w:t>
+        <w:t xml:space="preserve">docker exec -it </w:t>
+      </w:r>
+      <w:proofErr w:type="spellStart"/>
+      <w:r>
+        <w:t>kafka</w:t>
+      </w:r>
+      <w:proofErr w:type="spellEnd"/>
+      <w:r>
+        <w:t xml:space="preserve"> </w:t>
+      </w:r>
+      <w:proofErr w:type="spellStart"/>
+      <w:r>
+        <w:t>kafka</w:t>
+      </w:r>
+      <w:proofErr w:type="spellEnd"/>
+      <w:r>
+        <w:t>-topics --delete --topic inventory-topic-</w:t>
+      </w:r>
+      <w:proofErr w:type="spellStart"/>
+      <w:r>
+        <w:t>dlt</w:t>
+      </w:r>
+      <w:proofErr w:type="spellEnd"/>
+      <w:r>
+        <w:t xml:space="preserve"> --bootstrap-server localhost:9092</w:t>
       </w:r>
     </w:p>
     <w:p>
@@ -1219,7 +1887,151 @@
       </w:pPr>
       <w:r>
         <w:lastRenderedPageBreak/>
-        <w:t>docker exec -it kafka kafka-topics --delete --topic product-topic --bootstrap-server localhost:9092</w:t>
+        <w:t xml:space="preserve">docker exec -it </w:t>
+      </w:r>
+      <w:proofErr w:type="spellStart"/>
+      <w:r>
+        <w:t>kafka</w:t>
+      </w:r>
+      <w:proofErr w:type="spellEnd"/>
+      <w:r>
+        <w:t xml:space="preserve"> </w:t>
+      </w:r>
+      <w:proofErr w:type="spellStart"/>
+      <w:r>
+        <w:t>kafka</w:t>
+      </w:r>
+      <w:proofErr w:type="spellEnd"/>
+      <w:r>
+        <w:t>-topics --delete --topic order-topic --bootstrap-server localhost:9092</w:t>
+      </w:r>
+    </w:p>
+    <w:p>
+      <w:pPr>
+        <w:pStyle w:val="NoSpacing"/>
+      </w:pPr>
+      <w:r>
+        <w:t xml:space="preserve">docker exec -it </w:t>
+      </w:r>
+      <w:proofErr w:type="spellStart"/>
+      <w:r>
+        <w:t>kafka</w:t>
+      </w:r>
+      <w:proofErr w:type="spellEnd"/>
+      <w:r>
+        <w:t xml:space="preserve"> </w:t>
+      </w:r>
+      <w:proofErr w:type="spellStart"/>
+      <w:r>
+        <w:t>kafka</w:t>
+      </w:r>
+      <w:proofErr w:type="spellEnd"/>
+      <w:r>
+        <w:t>-topics --delete --topic order-topic-</w:t>
+      </w:r>
+      <w:proofErr w:type="spellStart"/>
+      <w:r>
+        <w:t>dlt</w:t>
+      </w:r>
+      <w:proofErr w:type="spellEnd"/>
+      <w:r>
+        <w:t xml:space="preserve"> --bootstrap-server localhost:9092</w:t>
+      </w:r>
+    </w:p>
+    <w:p>
+      <w:pPr>
+        <w:pStyle w:val="NoSpacing"/>
+      </w:pPr>
+      <w:r>
+        <w:t xml:space="preserve">docker exec -it </w:t>
+      </w:r>
+      <w:proofErr w:type="spellStart"/>
+      <w:r>
+        <w:t>kafka</w:t>
+      </w:r>
+      <w:proofErr w:type="spellEnd"/>
+      <w:r>
+        <w:t xml:space="preserve"> </w:t>
+      </w:r>
+      <w:proofErr w:type="spellStart"/>
+      <w:r>
+        <w:t>kafka</w:t>
+      </w:r>
+      <w:proofErr w:type="spellEnd"/>
+      <w:r>
+        <w:t>-topics --delete --topic order-topic-retry-0 --bootstrap-server localhost:9092</w:t>
+      </w:r>
+    </w:p>
+    <w:p>
+      <w:pPr>
+        <w:pStyle w:val="NoSpacing"/>
+      </w:pPr>
+      <w:r>
+        <w:t xml:space="preserve">docker exec -it </w:t>
+      </w:r>
+      <w:proofErr w:type="spellStart"/>
+      <w:r>
+        <w:t>kafka</w:t>
+      </w:r>
+      <w:proofErr w:type="spellEnd"/>
+      <w:r>
+        <w:t xml:space="preserve"> </w:t>
+      </w:r>
+      <w:proofErr w:type="spellStart"/>
+      <w:r>
+        <w:t>kafka</w:t>
+      </w:r>
+      <w:proofErr w:type="spellEnd"/>
+      <w:r>
+        <w:t>-topics --delete --topic order-topic-retry-1 --bootstrap-server localhost:9092</w:t>
+      </w:r>
+    </w:p>
+    <w:p>
+      <w:pPr>
+        <w:pStyle w:val="NoSpacing"/>
+      </w:pPr>
+      <w:r>
+        <w:t xml:space="preserve">docker exec -it </w:t>
+      </w:r>
+      <w:proofErr w:type="spellStart"/>
+      <w:r>
+        <w:t>kafka</w:t>
+      </w:r>
+      <w:proofErr w:type="spellEnd"/>
+      <w:r>
+        <w:t xml:space="preserve"> </w:t>
+      </w:r>
+      <w:proofErr w:type="spellStart"/>
+      <w:r>
+        <w:t>kafka</w:t>
+      </w:r>
+      <w:proofErr w:type="spellEnd"/>
+      <w:r>
+        <w:t>-topics --delete --topic payment-response-topic --bootstrap-server localhost:9092</w:t>
+      </w:r>
+    </w:p>
+    <w:p>
+      <w:pPr>
+        <w:pStyle w:val="NoSpacing"/>
+      </w:pPr>
+      <w:r>
+        <w:t xml:space="preserve">docker exec -it </w:t>
+      </w:r>
+      <w:proofErr w:type="spellStart"/>
+      <w:r>
+        <w:t>kafka</w:t>
+      </w:r>
+      <w:proofErr w:type="spellEnd"/>
+      <w:r>
+        <w:t xml:space="preserve"> </w:t>
+      </w:r>
+      <w:proofErr w:type="spellStart"/>
+      <w:r>
+        <w:t>kafka</w:t>
+      </w:r>
+      <w:proofErr w:type="spellEnd"/>
+      <w:r>
+        <w:t>-topics --delete --topic product-topic --bootstrap-server localhost:9092</w:t>
       </w:r>
     </w:p>
     <w:p>
@@ -1339,7 +2151,39 @@
           <w:b/>
           <w:bCs/>
         </w:rPr>
-        <w:t xml:space="preserve"> Why bootstrap.properties Instead of application.properties?</w:t>
+        <w:t xml:space="preserve"> Why </w:t>
+      </w:r>
+      <w:proofErr w:type="spellStart"/>
+      <w:r>
+        <w:rPr>
+          <w:b/>
+          <w:bCs/>
+        </w:rPr>
+        <w:t>bootstrap.properties</w:t>
+      </w:r>
+      <w:proofErr w:type="spellEnd"/>
+      <w:r>
+        <w:rPr>
+          <w:b/>
+          <w:bCs/>
+        </w:rPr>
+        <w:t xml:space="preserve"> Instead of </w:t>
+      </w:r>
+      <w:proofErr w:type="spellStart"/>
+      <w:r>
+        <w:rPr>
+          <w:b/>
+          <w:bCs/>
+        </w:rPr>
+        <w:t>application.properties</w:t>
+      </w:r>
+      <w:proofErr w:type="spellEnd"/>
+      <w:r>
+        <w:rPr>
+          <w:b/>
+          <w:bCs/>
+        </w:rPr>
+        <w:t>?</w:t>
       </w:r>
     </w:p>
     <w:p>
@@ -1423,8 +2267,13 @@
         <w:t>👉</w:t>
       </w:r>
       <w:r>
-        <w:t xml:space="preserve"> Spring must know WHERE Config Server is BEFORE loading application.properties</w:t>
-      </w:r>
+        <w:t xml:space="preserve"> Spring must know WHERE Config Server is BEFORE loading </w:t>
+      </w:r>
+      <w:proofErr w:type="spellStart"/>
+      <w:r>
+        <w:t>application.properties</w:t>
+      </w:r>
+      <w:proofErr w:type="spellEnd"/>
     </w:p>
     <w:p>
       <w:pPr>
@@ -1442,28 +2291,46 @@
           <w:bCs/>
         </w:rPr>
       </w:pPr>
+      <w:proofErr w:type="spellStart"/>
       <w:r>
         <w:rPr>
           <w:b/>
           <w:bCs/>
         </w:rPr>
-        <w:t>bootstrap.properties loads FIRST</w:t>
-      </w:r>
-    </w:p>
-    <w:p>
-      <w:pPr>
-        <w:pStyle w:val="NoSpacing"/>
+        <w:t>bootstrap.properties</w:t>
+      </w:r>
+      <w:proofErr w:type="spellEnd"/>
+      <w:r>
         <w:rPr>
           <w:b/>
           <w:bCs/>
         </w:rPr>
-      </w:pPr>
-      <w:r>
+        <w:t xml:space="preserve"> loads FIRST</w:t>
+      </w:r>
+    </w:p>
+    <w:p>
+      <w:pPr>
+        <w:pStyle w:val="NoSpacing"/>
         <w:rPr>
           <w:b/>
           <w:bCs/>
         </w:rPr>
-        <w:t>application.properties loads AFTER</w:t>
+      </w:pPr>
+      <w:proofErr w:type="spellStart"/>
+      <w:r>
+        <w:rPr>
+          <w:b/>
+          <w:bCs/>
+        </w:rPr>
+        <w:t>application.properties</w:t>
+      </w:r>
+      <w:proofErr w:type="spellEnd"/>
+      <w:r>
+        <w:rPr>
+          <w:b/>
+          <w:bCs/>
+        </w:rPr>
+        <w:t xml:space="preserve"> loads AFTER</w:t>
       </w:r>
     </w:p>
     <w:p>
@@ -1492,7 +2359,23 @@
           <w:b/>
           <w:bCs/>
         </w:rPr>
-        <w:t xml:space="preserve"> When Do We Use bootstrap.properties?</w:t>
+        <w:t xml:space="preserve"> When Do We Use </w:t>
+      </w:r>
+      <w:proofErr w:type="spellStart"/>
+      <w:r>
+        <w:rPr>
+          <w:b/>
+          <w:bCs/>
+        </w:rPr>
+        <w:t>bootstrap.properties</w:t>
+      </w:r>
+      <w:proofErr w:type="spellEnd"/>
+      <w:r>
+        <w:rPr>
+          <w:b/>
+          <w:bCs/>
+        </w:rPr>
+        <w:t>?</w:t>
       </w:r>
     </w:p>
     <w:p>
@@ -1593,14 +2476,31 @@
         <w:pStyle w:val="NoSpacing"/>
       </w:pPr>
       <w:r>
-        <w:t>Why bootstrap.properties instead of application.properties?</w:t>
-      </w:r>
-    </w:p>
-    <w:p>
-      <w:pPr>
-        <w:pStyle w:val="NoSpacing"/>
-      </w:pPr>
-      <w:r>
+        <w:t xml:space="preserve">Why </w:t>
+      </w:r>
+      <w:proofErr w:type="spellStart"/>
+      <w:r>
+        <w:t>bootstrap.properties</w:t>
+      </w:r>
+      <w:proofErr w:type="spellEnd"/>
+      <w:r>
+        <w:t xml:space="preserve"> instead of </w:t>
+      </w:r>
+      <w:proofErr w:type="spellStart"/>
+      <w:r>
+        <w:t>application.properties</w:t>
+      </w:r>
+      <w:proofErr w:type="spellEnd"/>
+      <w:r>
+        <w:t>?</w:t>
+      </w:r>
+    </w:p>
+    <w:p>
+      <w:pPr>
+        <w:pStyle w:val="NoSpacing"/>
+      </w:pPr>
+      <w:r>
+        <w:lastRenderedPageBreak/>
         <w:t>You say:</w:t>
       </w:r>
     </w:p>
@@ -1659,7 +2559,15 @@
         <w:pStyle w:val="NoSpacing"/>
       </w:pPr>
       <w:r>
-        <w:t>Why is spring.config.import required?</w:t>
+        <w:t xml:space="preserve">Why is </w:t>
+      </w:r>
+      <w:proofErr w:type="spellStart"/>
+      <w:r>
+        <w:t>spring.config.import</w:t>
+      </w:r>
+      <w:proofErr w:type="spellEnd"/>
+      <w:r>
+        <w:t xml:space="preserve"> required?</w:t>
       </w:r>
     </w:p>
     <w:p>
@@ -1675,8 +2583,15 @@
         <w:pStyle w:val="NoSpacing"/>
       </w:pPr>
       <w:r>
-        <w:lastRenderedPageBreak/>
-        <w:t>Starting Spring Boot 2.4, the bootstrap phase was removed by default, so external config locations must be explicitly defined using spring.config.import.</w:t>
+        <w:t xml:space="preserve">Starting Spring Boot 2.4, the bootstrap phase was removed by default, so external config locations must be explicitly defined using </w:t>
+      </w:r>
+      <w:proofErr w:type="spellStart"/>
+      <w:r>
+        <w:t>spring.config.import</w:t>
+      </w:r>
+      <w:proofErr w:type="spellEnd"/>
+      <w:r>
+        <w:t>.</w:t>
       </w:r>
     </w:p>
     <w:p>

</xml_diff>

<commit_message>
One command startup Dockerfile
</commit_message>
<xml_diff>
--- a/microserviceArchitechture.docx
+++ b/microserviceArchitechture.docx
@@ -81,39 +81,33 @@
           <w:b/>
           <w:bCs/>
         </w:rPr>
-        <w:t>Why server.port=8761?</w:t>
-      </w:r>
-    </w:p>
-    <w:p>
-      <w:pPr>
-        <w:pStyle w:val="NoSpacing"/>
-      </w:pPr>
-      <w:r>
-        <w:t>8761 is standard default port for Eureka.</w:t>
-      </w:r>
-    </w:p>
-    <w:p>
-      <w:pPr>
-        <w:pStyle w:val="NoSpacing"/>
+        <w:t xml:space="preserve">Why </w:t>
+      </w:r>
+      <w:proofErr w:type="spellStart"/>
+      <w:proofErr w:type="gramStart"/>
+      <w:r>
         <w:rPr>
           <w:b/>
           <w:bCs/>
         </w:rPr>
-      </w:pPr>
+        <w:t>server.port</w:t>
+      </w:r>
+      <w:proofErr w:type="spellEnd"/>
+      <w:proofErr w:type="gramEnd"/>
       <w:r>
         <w:rPr>
           <w:b/>
           <w:bCs/>
         </w:rPr>
-        <w:t>Why register-with-eureka=false?</w:t>
-      </w:r>
-    </w:p>
-    <w:p>
-      <w:pPr>
-        <w:pStyle w:val="NoSpacing"/>
-      </w:pPr>
-      <w:r>
-        <w:t>If true → this server tries to register itself as client (wrong).</w:t>
+        <w:t>=8761?</w:t>
+      </w:r>
+    </w:p>
+    <w:p>
+      <w:pPr>
+        <w:pStyle w:val="NoSpacing"/>
+      </w:pPr>
+      <w:r>
+        <w:t>8761 is standard default port for Eureka.</w:t>
       </w:r>
     </w:p>
     <w:p>
@@ -129,6 +123,30 @@
           <w:b/>
           <w:bCs/>
         </w:rPr>
+        <w:t>Why register-with-eureka=false?</w:t>
+      </w:r>
+    </w:p>
+    <w:p>
+      <w:pPr>
+        <w:pStyle w:val="NoSpacing"/>
+      </w:pPr>
+      <w:r>
+        <w:t>If true → this server tries to register itself as client (wrong).</w:t>
+      </w:r>
+    </w:p>
+    <w:p>
+      <w:pPr>
+        <w:pStyle w:val="NoSpacing"/>
+        <w:rPr>
+          <w:b/>
+          <w:bCs/>
+        </w:rPr>
+      </w:pPr>
+      <w:r>
+        <w:rPr>
+          <w:b/>
+          <w:bCs/>
+        </w:rPr>
         <w:t>What is self-preservation?</w:t>
       </w:r>
     </w:p>
@@ -152,8 +170,18 @@
       <w:pPr>
         <w:pStyle w:val="NoSpacing"/>
       </w:pPr>
-      <w:r>
-        <w:t>eureka.server.enable-self-preservation=true</w:t>
+      <w:proofErr w:type="spellStart"/>
+      <w:proofErr w:type="gramStart"/>
+      <w:r>
+        <w:t>eureka.server</w:t>
+      </w:r>
+      <w:proofErr w:type="gramEnd"/>
+      <w:r>
+        <w:t>.enable</w:t>
+      </w:r>
+      <w:proofErr w:type="spellEnd"/>
+      <w:r>
+        <w:t>-self-preservation=true</w:t>
       </w:r>
     </w:p>
     <w:p>
@@ -219,7 +247,23 @@
           <w:b/>
           <w:bCs/>
         </w:rPr>
-        <w:t>Spring WebFlux internally</w:t>
+        <w:t xml:space="preserve">Spring </w:t>
+      </w:r>
+      <w:proofErr w:type="spellStart"/>
+      <w:r>
+        <w:rPr>
+          <w:b/>
+          <w:bCs/>
+        </w:rPr>
+        <w:t>WebFlux</w:t>
+      </w:r>
+      <w:proofErr w:type="spellEnd"/>
+      <w:r>
+        <w:rPr>
+          <w:b/>
+          <w:bCs/>
+        </w:rPr>
+        <w:t xml:space="preserve"> internally</w:t>
       </w:r>
       <w:r>
         <w:t>.</w:t>
@@ -264,15 +308,39 @@
           <w:b/>
           <w:bCs/>
         </w:rPr>
-        <w:t xml:space="preserve"> How To Verify Gateway Is Correct</w:t>
-      </w:r>
-    </w:p>
-    <w:p>
-      <w:pPr>
-        <w:pStyle w:val="NoSpacing"/>
-      </w:pPr>
-      <w:r>
-        <w:t>When you run api-gateway, console should show:</w:t>
+        <w:t xml:space="preserve"> How </w:t>
+      </w:r>
+      <w:proofErr w:type="gramStart"/>
+      <w:r>
+        <w:rPr>
+          <w:b/>
+          <w:bCs/>
+        </w:rPr>
+        <w:t>To</w:t>
+      </w:r>
+      <w:proofErr w:type="gramEnd"/>
+      <w:r>
+        <w:rPr>
+          <w:b/>
+          <w:bCs/>
+        </w:rPr>
+        <w:t xml:space="preserve"> Verify Gateway Is Correct</w:t>
+      </w:r>
+    </w:p>
+    <w:p>
+      <w:pPr>
+        <w:pStyle w:val="NoSpacing"/>
+      </w:pPr>
+      <w:r>
+        <w:t xml:space="preserve">When you run </w:t>
+      </w:r>
+      <w:proofErr w:type="spellStart"/>
+      <w:r>
+        <w:t>api</w:t>
+      </w:r>
+      <w:proofErr w:type="spellEnd"/>
+      <w:r>
+        <w:t>-gateway, console should show:</w:t>
       </w:r>
     </w:p>
     <w:p>
@@ -348,8 +416,13 @@
         </w:numPr>
       </w:pPr>
       <w:r>
-        <w:t>Spring WebFlux</w:t>
-      </w:r>
+        <w:t xml:space="preserve">Spring </w:t>
+      </w:r>
+      <w:proofErr w:type="spellStart"/>
+      <w:r>
+        <w:t>WebFlux</w:t>
+      </w:r>
+      <w:proofErr w:type="spellEnd"/>
     </w:p>
     <w:p>
       <w:pPr>
@@ -534,8 +607,13 @@
         <w:pStyle w:val="NoSpacing"/>
       </w:pPr>
       <w:r>
-        <w:t>docker ps</w:t>
-      </w:r>
+        <w:t xml:space="preserve">docker </w:t>
+      </w:r>
+      <w:proofErr w:type="spellStart"/>
+      <w:r>
+        <w:t>ps</w:t>
+      </w:r>
+      <w:proofErr w:type="spellEnd"/>
     </w:p>
     <w:p>
       <w:pPr>
@@ -553,103 +631,194 @@
         <w:pStyle w:val="NoSpacing"/>
       </w:pPr>
       <w:r>
-        <w:t>docker restart kafka</w:t>
-      </w:r>
-    </w:p>
-    <w:p>
-      <w:pPr>
-        <w:pStyle w:val="NoSpacing"/>
-      </w:pPr>
-      <w:r>
-        <w:t>docker start brave_austin</w:t>
-      </w:r>
-    </w:p>
-    <w:p>
-      <w:pPr>
-        <w:pStyle w:val="NoSpacing"/>
-      </w:pPr>
-      <w:r>
-        <w:t>docker start bold_wiles</w:t>
-      </w:r>
-    </w:p>
-    <w:p>
-      <w:pPr>
-        <w:pStyle w:val="NoSpacing"/>
-      </w:pPr>
-      <w:r>
-        <w:t>docker start vigilant_tharp</w:t>
-      </w:r>
-    </w:p>
-    <w:p>
-      <w:pPr>
-        <w:pStyle w:val="NoSpacing"/>
-      </w:pPr>
-      <w:r>
-        <w:t>docker start stoic_wing</w:t>
-      </w:r>
-    </w:p>
-    <w:p>
-      <w:pPr>
-        <w:pStyle w:val="NoSpacing"/>
-      </w:pPr>
-      <w:r>
-        <w:t>docker start kafka-exporter</w:t>
-      </w:r>
-    </w:p>
-    <w:p>
-      <w:pPr>
-        <w:pStyle w:val="NoSpacing"/>
-      </w:pPr>
-      <w:r>
-        <w:t>docker start $(docker ps -aq)</w:t>
-      </w:r>
-    </w:p>
-    <w:p>
-      <w:pPr>
-        <w:pStyle w:val="NoSpacing"/>
-      </w:pPr>
-    </w:p>
-    <w:p>
-      <w:pPr>
-        <w:pStyle w:val="NoSpacing"/>
-      </w:pPr>
-      <w:r>
-        <w:t>docker ps -a</w:t>
-      </w:r>
-    </w:p>
-    <w:p>
-      <w:pPr>
-        <w:pStyle w:val="NoSpacing"/>
-      </w:pPr>
-    </w:p>
-    <w:p>
-      <w:pPr>
-        <w:pStyle w:val="NoSpacing"/>
-      </w:pPr>
-      <w:r>
-        <w:t>docker exec -it kafka kafka-topics --list --bootstrap-server localhost:9092</w:t>
-      </w:r>
-    </w:p>
-    <w:p>
-      <w:pPr>
-        <w:pStyle w:val="NoSpacing"/>
-      </w:pPr>
-    </w:p>
-    <w:p>
-      <w:pPr>
-        <w:pStyle w:val="NoSpacing"/>
-      </w:pPr>
-      <w:r>
-        <w:t>docker run -d -p 3000:3000 grafana/grafana</w:t>
-      </w:r>
-    </w:p>
-    <w:p>
-      <w:pPr>
-        <w:pStyle w:val="NoSpacing"/>
-      </w:pPr>
-      <w:r>
-        <w:t>docker run -d -p 6379:6379 redis</w:t>
-      </w:r>
+        <w:t xml:space="preserve">docker restart </w:t>
+      </w:r>
+      <w:proofErr w:type="spellStart"/>
+      <w:r>
+        <w:t>kafka</w:t>
+      </w:r>
+      <w:proofErr w:type="spellEnd"/>
+    </w:p>
+    <w:p>
+      <w:pPr>
+        <w:pStyle w:val="NoSpacing"/>
+      </w:pPr>
+      <w:r>
+        <w:t xml:space="preserve">docker start </w:t>
+      </w:r>
+      <w:proofErr w:type="spellStart"/>
+      <w:r>
+        <w:t>brave_austin</w:t>
+      </w:r>
+      <w:proofErr w:type="spellEnd"/>
+    </w:p>
+    <w:p>
+      <w:pPr>
+        <w:pStyle w:val="NoSpacing"/>
+      </w:pPr>
+      <w:r>
+        <w:t xml:space="preserve">docker start </w:t>
+      </w:r>
+      <w:proofErr w:type="spellStart"/>
+      <w:r>
+        <w:t>bold_wiles</w:t>
+      </w:r>
+      <w:proofErr w:type="spellEnd"/>
+    </w:p>
+    <w:p>
+      <w:pPr>
+        <w:pStyle w:val="NoSpacing"/>
+      </w:pPr>
+      <w:r>
+        <w:t xml:space="preserve">docker start </w:t>
+      </w:r>
+      <w:proofErr w:type="spellStart"/>
+      <w:r>
+        <w:t>vigilant_tharp</w:t>
+      </w:r>
+      <w:proofErr w:type="spellEnd"/>
+    </w:p>
+    <w:p>
+      <w:pPr>
+        <w:pStyle w:val="NoSpacing"/>
+      </w:pPr>
+      <w:r>
+        <w:t xml:space="preserve">docker start </w:t>
+      </w:r>
+      <w:proofErr w:type="spellStart"/>
+      <w:r>
+        <w:t>stoic_wing</w:t>
+      </w:r>
+      <w:proofErr w:type="spellEnd"/>
+    </w:p>
+    <w:p>
+      <w:pPr>
+        <w:pStyle w:val="NoSpacing"/>
+      </w:pPr>
+      <w:r>
+        <w:t xml:space="preserve">docker start </w:t>
+      </w:r>
+      <w:proofErr w:type="spellStart"/>
+      <w:r>
+        <w:t>kafka</w:t>
+      </w:r>
+      <w:proofErr w:type="spellEnd"/>
+      <w:r>
+        <w:t>-exporter</w:t>
+      </w:r>
+    </w:p>
+    <w:p>
+      <w:pPr>
+        <w:pStyle w:val="NoSpacing"/>
+      </w:pPr>
+      <w:r>
+        <w:t xml:space="preserve">docker start $(docker </w:t>
+      </w:r>
+      <w:proofErr w:type="spellStart"/>
+      <w:r>
+        <w:t>ps</w:t>
+      </w:r>
+      <w:proofErr w:type="spellEnd"/>
+      <w:r>
+        <w:t xml:space="preserve"> -</w:t>
+      </w:r>
+      <w:proofErr w:type="spellStart"/>
+      <w:r>
+        <w:t>aq</w:t>
+      </w:r>
+      <w:proofErr w:type="spellEnd"/>
+      <w:r>
+        <w:t>)</w:t>
+      </w:r>
+    </w:p>
+    <w:p>
+      <w:pPr>
+        <w:pStyle w:val="NoSpacing"/>
+      </w:pPr>
+    </w:p>
+    <w:p>
+      <w:pPr>
+        <w:pStyle w:val="NoSpacing"/>
+      </w:pPr>
+      <w:r>
+        <w:t xml:space="preserve">docker </w:t>
+      </w:r>
+      <w:proofErr w:type="spellStart"/>
+      <w:r>
+        <w:t>ps</w:t>
+      </w:r>
+      <w:proofErr w:type="spellEnd"/>
+      <w:r>
+        <w:t xml:space="preserve"> -a</w:t>
+      </w:r>
+    </w:p>
+    <w:p>
+      <w:pPr>
+        <w:pStyle w:val="NoSpacing"/>
+      </w:pPr>
+    </w:p>
+    <w:p>
+      <w:pPr>
+        <w:pStyle w:val="NoSpacing"/>
+      </w:pPr>
+      <w:r>
+        <w:t xml:space="preserve">docker exec -it </w:t>
+      </w:r>
+      <w:proofErr w:type="spellStart"/>
+      <w:r>
+        <w:t>kafka</w:t>
+      </w:r>
+      <w:proofErr w:type="spellEnd"/>
+      <w:r>
+        <w:t xml:space="preserve"> </w:t>
+      </w:r>
+      <w:proofErr w:type="spellStart"/>
+      <w:r>
+        <w:t>kafka</w:t>
+      </w:r>
+      <w:proofErr w:type="spellEnd"/>
+      <w:r>
+        <w:t>-topics --list --bootstrap-server localhost:9092</w:t>
+      </w:r>
+    </w:p>
+    <w:p>
+      <w:pPr>
+        <w:pStyle w:val="NoSpacing"/>
+      </w:pPr>
+    </w:p>
+    <w:p>
+      <w:pPr>
+        <w:pStyle w:val="NoSpacing"/>
+      </w:pPr>
+      <w:r>
+        <w:t xml:space="preserve">docker run -d -p 3000:3000 </w:t>
+      </w:r>
+      <w:proofErr w:type="spellStart"/>
+      <w:r>
+        <w:t>grafana</w:t>
+      </w:r>
+      <w:proofErr w:type="spellEnd"/>
+      <w:r>
+        <w:t>/</w:t>
+      </w:r>
+      <w:proofErr w:type="spellStart"/>
+      <w:r>
+        <w:t>grafana</w:t>
+      </w:r>
+      <w:proofErr w:type="spellEnd"/>
+    </w:p>
+    <w:p>
+      <w:pPr>
+        <w:pStyle w:val="NoSpacing"/>
+      </w:pPr>
+      <w:r>
+        <w:t xml:space="preserve">docker run -d -p 6379:6379 </w:t>
+      </w:r>
+      <w:proofErr w:type="spellStart"/>
+      <w:r>
+        <w:t>redis</w:t>
+      </w:r>
+      <w:proofErr w:type="spellEnd"/>
     </w:p>
     <w:p>
       <w:pPr>
@@ -672,20 +841,88 @@
         <w:pStyle w:val="NoSpacing"/>
       </w:pPr>
       <w:r>
-        <w:t>docker run -d -p 9308:9308 danielqsj/kafka-exporter --kafka.server=localhost:9092</w:t>
-      </w:r>
-    </w:p>
-    <w:p>
-      <w:pPr>
-        <w:pStyle w:val="NoSpacing"/>
-      </w:pPr>
-    </w:p>
-    <w:p>
-      <w:pPr>
-        <w:pStyle w:val="NoSpacing"/>
-      </w:pPr>
-      <w:r>
-        <w:t>docker run -d --name kafka-exporter -p 9308:9308 danielqsj/kafka-exporter --kafka.server=host.docker.internal:9092</w:t>
+        <w:t xml:space="preserve">docker run -d -p 9308:9308 </w:t>
+      </w:r>
+      <w:proofErr w:type="spellStart"/>
+      <w:r>
+        <w:t>danielqsj</w:t>
+      </w:r>
+      <w:proofErr w:type="spellEnd"/>
+      <w:r>
+        <w:t>/</w:t>
+      </w:r>
+      <w:proofErr w:type="spellStart"/>
+      <w:r>
+        <w:t>kafka</w:t>
+      </w:r>
+      <w:proofErr w:type="spellEnd"/>
+      <w:r>
+        <w:t>-exporter --</w:t>
+      </w:r>
+      <w:proofErr w:type="spellStart"/>
+      <w:proofErr w:type="gramStart"/>
+      <w:r>
+        <w:t>kafka.server</w:t>
+      </w:r>
+      <w:proofErr w:type="spellEnd"/>
+      <w:proofErr w:type="gramEnd"/>
+      <w:r>
+        <w:t>=localhost:9092</w:t>
+      </w:r>
+    </w:p>
+    <w:p>
+      <w:pPr>
+        <w:pStyle w:val="NoSpacing"/>
+      </w:pPr>
+    </w:p>
+    <w:p>
+      <w:pPr>
+        <w:pStyle w:val="NoSpacing"/>
+      </w:pPr>
+      <w:r>
+        <w:t xml:space="preserve">docker run -d --name </w:t>
+      </w:r>
+      <w:proofErr w:type="spellStart"/>
+      <w:r>
+        <w:t>kafka</w:t>
+      </w:r>
+      <w:proofErr w:type="spellEnd"/>
+      <w:r>
+        <w:t xml:space="preserve">-exporter -p 9308:9308 </w:t>
+      </w:r>
+      <w:proofErr w:type="spellStart"/>
+      <w:r>
+        <w:t>danielqsj</w:t>
+      </w:r>
+      <w:proofErr w:type="spellEnd"/>
+      <w:r>
+        <w:t>/</w:t>
+      </w:r>
+      <w:proofErr w:type="spellStart"/>
+      <w:r>
+        <w:t>kafka</w:t>
+      </w:r>
+      <w:proofErr w:type="spellEnd"/>
+      <w:r>
+        <w:t>-exporter --</w:t>
+      </w:r>
+      <w:proofErr w:type="spellStart"/>
+      <w:proofErr w:type="gramStart"/>
+      <w:r>
+        <w:t>kafka.server</w:t>
+      </w:r>
+      <w:proofErr w:type="spellEnd"/>
+      <w:proofErr w:type="gramEnd"/>
+      <w:r>
+        <w:t>=</w:t>
+      </w:r>
+      <w:proofErr w:type="gramStart"/>
+      <w:r>
+        <w:t>host.docker</w:t>
+      </w:r>
+      <w:proofErr w:type="gramEnd"/>
+      <w:r>
+        <w:t>.internal:9092</w:t>
       </w:r>
     </w:p>
     <w:p>
@@ -704,8 +941,13 @@
         <w:t>C:\Vikas\study\e-commerece-app</w:t>
       </w:r>
       <w:r>
-        <w:t>\prometheus.yml:/etc/prometheus/prometheus.yml prom/prometheus</w:t>
-      </w:r>
+        <w:t>\prometheus.yml:/etc/prometheus/prometheus.yml prom/</w:t>
+      </w:r>
+      <w:proofErr w:type="spellStart"/>
+      <w:r>
+        <w:t>prometheus</w:t>
+      </w:r>
+      <w:proofErr w:type="spellEnd"/>
     </w:p>
     <w:p>
       <w:pPr>
@@ -730,85 +972,180 @@
         <w:pStyle w:val="NoSpacing"/>
       </w:pPr>
       <w:r>
-        <w:t>docker run -d --name kafka -p 9092:9092 -e KAFKA_ZOOKEEPER_CONNECT=host.docker.internal:2181 -e KAFKA_ADVERTISED_LISTENERS=PLAINTEXT://localhost:9092 -e KAFKA_OFFSETS_TOPIC_REPLICATION_FACTOR=1 confluentinc/cp-kafka</w:t>
-      </w:r>
-    </w:p>
-    <w:p>
-      <w:pPr>
-        <w:pStyle w:val="NoSpacing"/>
-      </w:pPr>
-    </w:p>
-    <w:p>
-      <w:pPr>
-        <w:pStyle w:val="NoSpacing"/>
-      </w:pPr>
-      <w:r>
-        <w:t>netstat -ano | findstr 9092</w:t>
-      </w:r>
-    </w:p>
-    <w:p>
-      <w:pPr>
-        <w:pStyle w:val="NoSpacing"/>
-      </w:pPr>
-      <w:r>
-        <w:t>docker rm -f kafka zookeeper</w:t>
-      </w:r>
-    </w:p>
-    <w:p>
-      <w:pPr>
-        <w:pStyle w:val="NoSpacing"/>
-      </w:pPr>
-    </w:p>
-    <w:p>
-      <w:pPr>
-        <w:pStyle w:val="NoSpacing"/>
-      </w:pPr>
-      <w:r>
-        <w:t>docker run -d --name zookeeper -p 2181:2181 -e ZOOKEEPER_CLIENT_PORT=2181 -e ZOOKEEPER_TICK_TIME=2000 confluentinc/cp-zookeeper:7.5.0</w:t>
-      </w:r>
-    </w:p>
-    <w:p>
-      <w:pPr>
-        <w:pStyle w:val="NoSpacing"/>
-      </w:pPr>
-    </w:p>
-    <w:p>
-      <w:pPr>
-        <w:pStyle w:val="NoSpacing"/>
-      </w:pPr>
-      <w:r>
-        <w:t xml:space="preserve">docker run -d --name kafka -p 9092:9092 -e KAFKA_BROKER_ID=1 -e KAFKA_ZOOKEEPER_CONNECT=host.docker.internal:2181 -e </w:t>
+        <w:t xml:space="preserve">docker run -d --name </w:t>
+      </w:r>
+      <w:proofErr w:type="spellStart"/>
+      <w:r>
+        <w:t>kafka</w:t>
+      </w:r>
+      <w:proofErr w:type="spellEnd"/>
+      <w:r>
+        <w:t xml:space="preserve"> -p 9092:9092 -e KAFKA_ZOOKEEPER_</w:t>
+      </w:r>
+      <w:proofErr w:type="gramStart"/>
+      <w:r>
+        <w:t>CONNECT=host.docker.internal</w:t>
+      </w:r>
+      <w:proofErr w:type="gramEnd"/>
+      <w:r>
+        <w:t xml:space="preserve">:2181 -e KAFKA_ADVERTISED_LISTENERS=PLAINTEXT://localhost:9092 -e KAFKA_OFFSETS_TOPIC_REPLICATION_FACTOR=1 </w:t>
+      </w:r>
+      <w:proofErr w:type="spellStart"/>
+      <w:r>
+        <w:t>confluentinc</w:t>
+      </w:r>
+      <w:proofErr w:type="spellEnd"/>
+      <w:r>
+        <w:t>/cp-</w:t>
+      </w:r>
+      <w:proofErr w:type="spellStart"/>
+      <w:r>
+        <w:t>kafka</w:t>
+      </w:r>
+      <w:proofErr w:type="spellEnd"/>
+    </w:p>
+    <w:p>
+      <w:pPr>
+        <w:pStyle w:val="NoSpacing"/>
+      </w:pPr>
+    </w:p>
+    <w:p>
+      <w:pPr>
+        <w:pStyle w:val="NoSpacing"/>
+      </w:pPr>
+      <w:r>
+        <w:t>netstat -</w:t>
+      </w:r>
+      <w:proofErr w:type="spellStart"/>
+      <w:r>
+        <w:t>ano</w:t>
+      </w:r>
+      <w:proofErr w:type="spellEnd"/>
+      <w:r>
+        <w:t xml:space="preserve"> | </w:t>
+      </w:r>
+      <w:proofErr w:type="spellStart"/>
+      <w:r>
+        <w:t>findstr</w:t>
+      </w:r>
+      <w:proofErr w:type="spellEnd"/>
+      <w:r>
+        <w:t xml:space="preserve"> 9092</w:t>
+      </w:r>
+    </w:p>
+    <w:p>
+      <w:pPr>
+        <w:pStyle w:val="NoSpacing"/>
+      </w:pPr>
+      <w:r>
+        <w:t xml:space="preserve">docker rm -f </w:t>
+      </w:r>
+      <w:proofErr w:type="spellStart"/>
+      <w:r>
+        <w:t>kafka</w:t>
+      </w:r>
+      <w:proofErr w:type="spellEnd"/>
+      <w:r>
+        <w:t xml:space="preserve"> zookeeper</w:t>
+      </w:r>
+    </w:p>
+    <w:p>
+      <w:pPr>
+        <w:pStyle w:val="NoSpacing"/>
+      </w:pPr>
+    </w:p>
+    <w:p>
+      <w:pPr>
+        <w:pStyle w:val="NoSpacing"/>
+      </w:pPr>
+      <w:r>
+        <w:t xml:space="preserve">docker run -d --name zookeeper -p 2181:2181 -e ZOOKEEPER_CLIENT_PORT=2181 -e ZOOKEEPER_TICK_TIME=2000 </w:t>
+      </w:r>
+      <w:proofErr w:type="spellStart"/>
+      <w:r>
+        <w:t>confluentinc</w:t>
+      </w:r>
+      <w:proofErr w:type="spellEnd"/>
+      <w:r>
+        <w:t>/cp-zookeeper:7.5.0</w:t>
+      </w:r>
+    </w:p>
+    <w:p>
+      <w:pPr>
+        <w:pStyle w:val="NoSpacing"/>
+      </w:pPr>
+    </w:p>
+    <w:p>
+      <w:pPr>
+        <w:pStyle w:val="NoSpacing"/>
+      </w:pPr>
+      <w:r>
+        <w:t xml:space="preserve">docker run -d --name </w:t>
+      </w:r>
+      <w:proofErr w:type="spellStart"/>
+      <w:r>
+        <w:t>kafka</w:t>
+      </w:r>
+      <w:proofErr w:type="spellEnd"/>
+      <w:r>
+        <w:t xml:space="preserve"> -p 9092:9092 -e KAFKA_BROKER_ID=1 -e KAFKA_ZOOKEEPER_</w:t>
+      </w:r>
+      <w:proofErr w:type="gramStart"/>
+      <w:r>
+        <w:t>CONNECT=host.docker.internal</w:t>
+      </w:r>
+      <w:proofErr w:type="gramEnd"/>
+      <w:r>
+        <w:t xml:space="preserve">:2181 -e </w:t>
       </w:r>
       <w:r>
         <w:lastRenderedPageBreak/>
-        <w:t>KAFKA_ADVERTISED_LISTENERS=PLAINTEXT://localhost:9092 -e KAFKA_OFFSETS_TOPIC_REPLICATION_FACTOR=1 confluentinc/cp-kafka:7.5.0</w:t>
-      </w:r>
-    </w:p>
-    <w:p>
-      <w:pPr>
-        <w:pStyle w:val="NoSpacing"/>
-      </w:pPr>
-    </w:p>
-    <w:p>
-      <w:pPr>
-        <w:pStyle w:val="NoSpacing"/>
-      </w:pPr>
-      <w:r>
-        <w:t>docker ps</w:t>
-      </w:r>
-    </w:p>
-    <w:p>
-      <w:pPr>
-        <w:pStyle w:val="NoSpacing"/>
-      </w:pPr>
-    </w:p>
-    <w:p>
-      <w:pPr>
-        <w:pStyle w:val="NoSpacing"/>
-      </w:pPr>
-      <w:r>
-        <w:t>docker stop kafka</w:t>
-      </w:r>
+        <w:t xml:space="preserve">KAFKA_ADVERTISED_LISTENERS=PLAINTEXT://localhost:9092 -e KAFKA_OFFSETS_TOPIC_REPLICATION_FACTOR=1 </w:t>
+      </w:r>
+      <w:proofErr w:type="spellStart"/>
+      <w:r>
+        <w:t>confluentinc</w:t>
+      </w:r>
+      <w:proofErr w:type="spellEnd"/>
+      <w:r>
+        <w:t>/cp-kafka:7.5.0</w:t>
+      </w:r>
+    </w:p>
+    <w:p>
+      <w:pPr>
+        <w:pStyle w:val="NoSpacing"/>
+      </w:pPr>
+    </w:p>
+    <w:p>
+      <w:pPr>
+        <w:pStyle w:val="NoSpacing"/>
+      </w:pPr>
+      <w:r>
+        <w:t xml:space="preserve">docker </w:t>
+      </w:r>
+      <w:proofErr w:type="spellStart"/>
+      <w:r>
+        <w:t>ps</w:t>
+      </w:r>
+      <w:proofErr w:type="spellEnd"/>
+    </w:p>
+    <w:p>
+      <w:pPr>
+        <w:pStyle w:val="NoSpacing"/>
+      </w:pPr>
+    </w:p>
+    <w:p>
+      <w:pPr>
+        <w:pStyle w:val="NoSpacing"/>
+      </w:pPr>
+      <w:r>
+        <w:t xml:space="preserve">docker stop </w:t>
+      </w:r>
+      <w:proofErr w:type="spellStart"/>
+      <w:r>
+        <w:t>kafka</w:t>
+      </w:r>
+      <w:proofErr w:type="spellEnd"/>
     </w:p>
     <w:p>
       <w:pPr>
@@ -823,8 +1160,13 @@
         <w:pStyle w:val="NoSpacing"/>
       </w:pPr>
       <w:r>
-        <w:t>docker rm kafka</w:t>
-      </w:r>
+        <w:t xml:space="preserve">docker rm </w:t>
+      </w:r>
+      <w:proofErr w:type="spellStart"/>
+      <w:r>
+        <w:t>kafka</w:t>
+      </w:r>
+      <w:proofErr w:type="spellEnd"/>
     </w:p>
     <w:p>
       <w:pPr>
@@ -862,7 +1204,15 @@
         <w:pStyle w:val="NoSpacing"/>
       </w:pPr>
       <w:r>
-        <w:t>docker volume rm &lt;volume_name&gt;</w:t>
+        <w:t>docker volume rm &lt;</w:t>
+      </w:r>
+      <w:proofErr w:type="spellStart"/>
+      <w:r>
+        <w:t>volume_name</w:t>
+      </w:r>
+      <w:proofErr w:type="spellEnd"/>
+      <w:r>
+        <w:t>&gt;</w:t>
       </w:r>
     </w:p>
     <w:p>
@@ -893,65 +1243,113 @@
         <w:pStyle w:val="NoSpacing"/>
       </w:pPr>
       <w:r>
-        <w:t>docker run -d --name zookeeper -p 2181:2181 -e ZOOKEEPER_CLIENT_PORT=2181 -e ZOOKEEPER_TICK_TIME=2000 confluentinc/cp-zookeeper:7.5.0</w:t>
-      </w:r>
-    </w:p>
-    <w:p>
-      <w:pPr>
-        <w:pStyle w:val="NoSpacing"/>
-      </w:pPr>
-    </w:p>
-    <w:p>
-      <w:pPr>
-        <w:pStyle w:val="NoSpacing"/>
-      </w:pPr>
-    </w:p>
-    <w:p>
-      <w:pPr>
-        <w:pStyle w:val="NoSpacing"/>
-      </w:pPr>
-      <w:r>
-        <w:t>docker run -d --name kafka -p 9092:9092 -e KAFKA_BROKER_ID=1 -e KAFKA_ZOOKEEPER_CONNECT=host.docker.internal:2181 -e KAFKA_ADVERTISED_LISTENERS=PLAINTEXT://localhost:9092 -e KAFKA_OFFSETS_TOPIC_REPLICATION_FACTOR=1 confluentinc/cp-kafka:7.5.0</w:t>
-      </w:r>
-    </w:p>
-    <w:p>
-      <w:pPr>
-        <w:pStyle w:val="NoSpacing"/>
-      </w:pPr>
-    </w:p>
-    <w:p>
-      <w:pPr>
-        <w:pStyle w:val="NoSpacing"/>
-      </w:pPr>
-      <w:r>
-        <w:t>netstat -ano | findstr 9092</w:t>
-      </w:r>
-    </w:p>
-    <w:p>
-      <w:pPr>
-        <w:pStyle w:val="NoSpacing"/>
-      </w:pPr>
-    </w:p>
-    <w:p>
-      <w:pPr>
-        <w:pStyle w:val="NoSpacing"/>
-      </w:pPr>
-      <w:r>
-        <w:t>docker exec -it kafka bash</w:t>
-      </w:r>
-    </w:p>
-    <w:p>
-      <w:pPr>
-        <w:pStyle w:val="NoSpacing"/>
-      </w:pPr>
-    </w:p>
-    <w:p>
-      <w:pPr>
-        <w:pStyle w:val="NoSpacing"/>
-      </w:pPr>
-      <w:r>
-        <w:t>docker restart kafka</w:t>
-      </w:r>
+        <w:t xml:space="preserve">docker run -d --name zookeeper -p 2181:2181 -e ZOOKEEPER_CLIENT_PORT=2181 -e ZOOKEEPER_TICK_TIME=2000 </w:t>
+      </w:r>
+      <w:proofErr w:type="spellStart"/>
+      <w:r>
+        <w:t>confluentinc</w:t>
+      </w:r>
+      <w:proofErr w:type="spellEnd"/>
+      <w:r>
+        <w:t>/cp-zookeeper:7.5.0</w:t>
+      </w:r>
+    </w:p>
+    <w:p>
+      <w:pPr>
+        <w:pStyle w:val="NoSpacing"/>
+      </w:pPr>
+    </w:p>
+    <w:p>
+      <w:pPr>
+        <w:pStyle w:val="NoSpacing"/>
+      </w:pPr>
+    </w:p>
+    <w:p>
+      <w:pPr>
+        <w:pStyle w:val="NoSpacing"/>
+      </w:pPr>
+      <w:r>
+        <w:t xml:space="preserve">docker run -d --name </w:t>
+      </w:r>
+      <w:proofErr w:type="spellStart"/>
+      <w:r>
+        <w:t>kafka</w:t>
+      </w:r>
+      <w:proofErr w:type="spellEnd"/>
+      <w:r>
+        <w:t xml:space="preserve"> -p 9092:9092 -e KAFKA_BROKER_ID=1 -e KAFKA_ZOOKEEPER_</w:t>
+      </w:r>
+      <w:proofErr w:type="gramStart"/>
+      <w:r>
+        <w:t>CONNECT=host.docker.internal</w:t>
+      </w:r>
+      <w:proofErr w:type="gramEnd"/>
+      <w:r>
+        <w:t xml:space="preserve">:2181 -e KAFKA_ADVERTISED_LISTENERS=PLAINTEXT://localhost:9092 -e KAFKA_OFFSETS_TOPIC_REPLICATION_FACTOR=1 </w:t>
+      </w:r>
+      <w:proofErr w:type="spellStart"/>
+      <w:r>
+        <w:t>confluentinc</w:t>
+      </w:r>
+      <w:proofErr w:type="spellEnd"/>
+      <w:r>
+        <w:t>/cp-kafka:7.5.0</w:t>
+      </w:r>
+    </w:p>
+    <w:p>
+      <w:pPr>
+        <w:pStyle w:val="NoSpacing"/>
+      </w:pPr>
+    </w:p>
+    <w:p>
+      <w:pPr>
+        <w:pStyle w:val="NoSpacing"/>
+      </w:pPr>
+      <w:r>
+        <w:t>netstat -</w:t>
+      </w:r>
+      <w:proofErr w:type="spellStart"/>
+      <w:r>
+        <w:t>ano</w:t>
+      </w:r>
+      <w:proofErr w:type="spellEnd"/>
+      <w:r>
+        <w:t xml:space="preserve"> | </w:t>
+      </w:r>
+      <w:proofErr w:type="spellStart"/>
+      <w:r>
+        <w:t>findstr</w:t>
+      </w:r>
+      <w:proofErr w:type="spellEnd"/>
+      <w:r>
+        <w:t xml:space="preserve"> 9092</w:t>
+      </w:r>
+    </w:p>
+    <w:p>
+      <w:pPr>
+        <w:pStyle w:val="NoSpacing"/>
+      </w:pPr>
+    </w:p>
+    <w:p>
+      <w:pPr>
+        <w:pStyle w:val="NoSpacing"/>
+      </w:pPr>
+      <w:r>
+        <w:t xml:space="preserve">docker exec -it </w:t>
+      </w:r>
+      <w:proofErr w:type="spellStart"/>
+      <w:r>
+        <w:t>kafka</w:t>
+      </w:r>
+      <w:proofErr w:type="spellEnd"/>
+      <w:r>
+        <w:t xml:space="preserve"> bash</w:t>
+      </w:r>
+    </w:p>
+    <w:p>
+      <w:pPr>
+        <w:pStyle w:val="NoSpacing"/>
+      </w:pPr>
     </w:p>
     <w:p>
       <w:pPr>
@@ -960,6 +1358,19 @@
       <w:r>
         <w:t xml:space="preserve">docker restart </w:t>
       </w:r>
+      <w:proofErr w:type="spellStart"/>
+      <w:r>
+        <w:t>kafka</w:t>
+      </w:r>
+      <w:proofErr w:type="spellEnd"/>
+    </w:p>
+    <w:p>
+      <w:pPr>
+        <w:pStyle w:val="NoSpacing"/>
+      </w:pPr>
+      <w:r>
+        <w:t xml:space="preserve">docker restart </w:t>
+      </w:r>
       <w:r>
         <w:t>zookeeper</w:t>
       </w:r>
@@ -974,20 +1385,52 @@
         <w:pStyle w:val="NoSpacing"/>
       </w:pPr>
       <w:r>
-        <w:t>docker exec -it kafka kafka-topics --delete --topic product-topic --bootstrap-server localhost:9092</w:t>
-      </w:r>
-    </w:p>
-    <w:p>
-      <w:pPr>
-        <w:pStyle w:val="NoSpacing"/>
-      </w:pPr>
-    </w:p>
-    <w:p>
-      <w:pPr>
-        <w:pStyle w:val="NoSpacing"/>
-      </w:pPr>
-      <w:r>
-        <w:t>docker exec -it kafka kafka-topics --create --topic order-topic --bootstrap-server localhost:9092 --replication-factor 1 --partitions 1</w:t>
+        <w:t xml:space="preserve">docker exec -it </w:t>
+      </w:r>
+      <w:proofErr w:type="spellStart"/>
+      <w:r>
+        <w:t>kafka</w:t>
+      </w:r>
+      <w:proofErr w:type="spellEnd"/>
+      <w:r>
+        <w:t xml:space="preserve"> </w:t>
+      </w:r>
+      <w:proofErr w:type="spellStart"/>
+      <w:r>
+        <w:t>kafka</w:t>
+      </w:r>
+      <w:proofErr w:type="spellEnd"/>
+      <w:r>
+        <w:t>-topics --delete --topic product-topic --bootstrap-server localhost:9092</w:t>
+      </w:r>
+    </w:p>
+    <w:p>
+      <w:pPr>
+        <w:pStyle w:val="NoSpacing"/>
+      </w:pPr>
+    </w:p>
+    <w:p>
+      <w:pPr>
+        <w:pStyle w:val="NoSpacing"/>
+      </w:pPr>
+      <w:r>
+        <w:t xml:space="preserve">docker exec -it </w:t>
+      </w:r>
+      <w:proofErr w:type="spellStart"/>
+      <w:r>
+        <w:t>kafka</w:t>
+      </w:r>
+      <w:proofErr w:type="spellEnd"/>
+      <w:r>
+        <w:t xml:space="preserve"> </w:t>
+      </w:r>
+      <w:proofErr w:type="spellStart"/>
+      <w:r>
+        <w:t>kafka</w:t>
+      </w:r>
+      <w:proofErr w:type="spellEnd"/>
+      <w:r>
+        <w:t>-topics --create --topic order-topic --bootstrap-server localhost:9092 --replication-factor 1 --partitions 1</w:t>
       </w:r>
     </w:p>
     <w:p>
@@ -1036,7 +1479,23 @@
       </w:pPr>
       <w:r>
         <w:lastRenderedPageBreak/>
-        <w:t>docker exec -it kafka kafka-topics --list --bootstrap-server localhost:9092</w:t>
+        <w:t xml:space="preserve">docker exec -it </w:t>
+      </w:r>
+      <w:proofErr w:type="spellStart"/>
+      <w:r>
+        <w:t>kafka</w:t>
+      </w:r>
+      <w:proofErr w:type="spellEnd"/>
+      <w:r>
+        <w:t xml:space="preserve"> </w:t>
+      </w:r>
+      <w:proofErr w:type="spellStart"/>
+      <w:r>
+        <w:t>kafka</w:t>
+      </w:r>
+      <w:proofErr w:type="spellEnd"/>
+      <w:r>
+        <w:t>-topics --list --bootstrap-server localhost:9092</w:t>
       </w:r>
     </w:p>
     <w:p>
@@ -1101,7 +1560,25 @@
         <w:t xml:space="preserve"> </w:t>
       </w:r>
       <w:r>
-        <w:t>--topic order-topic --property parse.key=true --property key.separator=:</w:t>
+        <w:t xml:space="preserve">--topic order-topic --property </w:t>
+      </w:r>
+      <w:proofErr w:type="spellStart"/>
+      <w:r>
+        <w:t>parse.key</w:t>
+      </w:r>
+      <w:proofErr w:type="spellEnd"/>
+      <w:r>
+        <w:t xml:space="preserve">=true --property </w:t>
+      </w:r>
+      <w:proofErr w:type="spellStart"/>
+      <w:proofErr w:type="gramStart"/>
+      <w:r>
+        <w:t>key.separator</w:t>
+      </w:r>
+      <w:proofErr w:type="spellEnd"/>
+      <w:proofErr w:type="gramEnd"/>
+      <w:r>
+        <w:t>=:</w:t>
       </w:r>
     </w:p>
     <w:p>
@@ -1123,33 +1600,75 @@
         <w:t xml:space="preserve"> </w:t>
       </w:r>
       <w:r>
-        <w:t>--topic payment-topic --bootstrap-server localhost:9092 --property print.partition=true</w:t>
-      </w:r>
-    </w:p>
-    <w:p>
-      <w:pPr>
-        <w:pStyle w:val="NoSpacing"/>
-      </w:pPr>
-    </w:p>
-    <w:p>
-      <w:pPr>
-        <w:pStyle w:val="NoSpacing"/>
-      </w:pPr>
-      <w:r>
-        <w:t>docker exec -it kafka kafka-topics --create --topic order-topic --bootstrap-server localhost:9092 --replication-factor 1 --partitions 1</w:t>
-      </w:r>
-    </w:p>
-    <w:p>
-      <w:pPr>
-        <w:pStyle w:val="NoSpacing"/>
-      </w:pPr>
-    </w:p>
-    <w:p>
-      <w:pPr>
-        <w:pStyle w:val="NoSpacing"/>
-      </w:pPr>
-      <w:r>
-        <w:t xml:space="preserve">docker exec -it kafka kafka-topics --create --topic </w:t>
+        <w:t xml:space="preserve">--topic payment-topic --bootstrap-server localhost:9092 --property </w:t>
+      </w:r>
+      <w:proofErr w:type="spellStart"/>
+      <w:proofErr w:type="gramStart"/>
+      <w:r>
+        <w:t>print.partition</w:t>
+      </w:r>
+      <w:proofErr w:type="spellEnd"/>
+      <w:proofErr w:type="gramEnd"/>
+      <w:r>
+        <w:t>=true</w:t>
+      </w:r>
+    </w:p>
+    <w:p>
+      <w:pPr>
+        <w:pStyle w:val="NoSpacing"/>
+      </w:pPr>
+    </w:p>
+    <w:p>
+      <w:pPr>
+        <w:pStyle w:val="NoSpacing"/>
+      </w:pPr>
+      <w:r>
+        <w:t xml:space="preserve">docker exec -it </w:t>
+      </w:r>
+      <w:proofErr w:type="spellStart"/>
+      <w:r>
+        <w:t>kafka</w:t>
+      </w:r>
+      <w:proofErr w:type="spellEnd"/>
+      <w:r>
+        <w:t xml:space="preserve"> </w:t>
+      </w:r>
+      <w:proofErr w:type="spellStart"/>
+      <w:r>
+        <w:t>kafka</w:t>
+      </w:r>
+      <w:proofErr w:type="spellEnd"/>
+      <w:r>
+        <w:t>-topics --create --topic order-topic --bootstrap-server localhost:9092 --replication-factor 1 --partitions 1</w:t>
+      </w:r>
+    </w:p>
+    <w:p>
+      <w:pPr>
+        <w:pStyle w:val="NoSpacing"/>
+      </w:pPr>
+    </w:p>
+    <w:p>
+      <w:pPr>
+        <w:pStyle w:val="NoSpacing"/>
+      </w:pPr>
+      <w:r>
+        <w:t xml:space="preserve">docker exec -it </w:t>
+      </w:r>
+      <w:proofErr w:type="spellStart"/>
+      <w:r>
+        <w:t>kafka</w:t>
+      </w:r>
+      <w:proofErr w:type="spellEnd"/>
+      <w:r>
+        <w:t xml:space="preserve"> </w:t>
+      </w:r>
+      <w:proofErr w:type="spellStart"/>
+      <w:r>
+        <w:t>kafka</w:t>
+      </w:r>
+      <w:proofErr w:type="spellEnd"/>
+      <w:r>
+        <w:t xml:space="preserve">-topics --create --topic </w:t>
       </w:r>
       <w:r>
         <w:t>product-topic</w:t>
@@ -1171,103 +1690,247 @@
         <w:pStyle w:val="NoSpacing"/>
       </w:pPr>
       <w:r>
-        <w:t>docker exec -it kafka kafka-topics --create --topic inventory-topic --bootstrap-server localhost:9092 --partitions 1 --replication-factor 1</w:t>
-      </w:r>
-    </w:p>
-    <w:p>
-      <w:pPr>
-        <w:pStyle w:val="NoSpacing"/>
-      </w:pPr>
-    </w:p>
-    <w:p>
-      <w:pPr>
-        <w:pStyle w:val="NoSpacing"/>
-      </w:pPr>
-      <w:r>
-        <w:t>docker exec -it kafka kafka-topics --create --topic inventory-topic-dlt --bootstrap-server localhost:9092 --partitions 1 --replication-factor 1</w:t>
-      </w:r>
-    </w:p>
-    <w:p>
-      <w:pPr>
-        <w:pStyle w:val="NoSpacing"/>
-      </w:pPr>
-    </w:p>
-    <w:p>
-      <w:pPr>
-        <w:pStyle w:val="NoSpacing"/>
-      </w:pPr>
-      <w:r>
-        <w:t>docker exec -it kafka kafka-topics --create --topic order-topic-dlt --bootstrap-server localhost:9092 --partitions 1 --replication-factor 1</w:t>
-      </w:r>
-    </w:p>
-    <w:p>
-      <w:pPr>
-        <w:pStyle w:val="NoSpacing"/>
-      </w:pPr>
-    </w:p>
-    <w:p>
-      <w:pPr>
-        <w:pStyle w:val="NoSpacing"/>
-      </w:pPr>
-      <w:r>
-        <w:t>docker exec -it kafka kafka-consumer-groups --bootstrap-server localhost:9092 --group inventory-group --topic order-topic --reset-offsets --to-latest --execute</w:t>
-      </w:r>
-    </w:p>
-    <w:p>
-      <w:pPr>
-        <w:pStyle w:val="NoSpacing"/>
-      </w:pPr>
-    </w:p>
-    <w:p>
-      <w:pPr>
-        <w:pStyle w:val="NoSpacing"/>
-      </w:pPr>
-      <w:r>
-        <w:t>docker exec -it kafka kafka-consumer-groups --bootstrap-server localhost:9092 --describe --group inventory-group</w:t>
-      </w:r>
-    </w:p>
-    <w:p>
-      <w:pPr>
-        <w:pStyle w:val="NoSpacing"/>
-      </w:pPr>
-    </w:p>
-    <w:p>
-      <w:pPr>
-        <w:pStyle w:val="NoSpacing"/>
-      </w:pPr>
-      <w:r>
-        <w:t>docker exec -it kafka kafka-consumer-groups --bootstrap-server localhost:9092 --group inventory-group --topic order-topic --reset-offsets --to-latest --execute</w:t>
-      </w:r>
-    </w:p>
-    <w:p>
-      <w:pPr>
-        <w:pStyle w:val="NoSpacing"/>
-      </w:pPr>
-    </w:p>
-    <w:p>
-      <w:pPr>
-        <w:pStyle w:val="NoSpacing"/>
-      </w:pPr>
-    </w:p>
-    <w:p>
-      <w:pPr>
-        <w:pStyle w:val="NoSpacing"/>
-      </w:pPr>
-      <w:r>
-        <w:t>docker exec -it kafka kafka-consumer-groups --bootstrap-server localhost:9092 --delete --group inventory-group</w:t>
-      </w:r>
-    </w:p>
-    <w:p>
-      <w:pPr>
-        <w:pStyle w:val="NoSpacing"/>
-      </w:pPr>
-    </w:p>
-    <w:p>
-      <w:pPr>
-        <w:pStyle w:val="NoSpacing"/>
-      </w:pPr>
-      <w:r>
-        <w:t>docker exec -it kafka kafka-topics --describe --topic payment-topic --bootstrap-server localhost:9092</w:t>
+        <w:t xml:space="preserve">docker exec -it </w:t>
+      </w:r>
+      <w:proofErr w:type="spellStart"/>
+      <w:r>
+        <w:t>kafka</w:t>
+      </w:r>
+      <w:proofErr w:type="spellEnd"/>
+      <w:r>
+        <w:t xml:space="preserve"> </w:t>
+      </w:r>
+      <w:proofErr w:type="spellStart"/>
+      <w:r>
+        <w:t>kafka</w:t>
+      </w:r>
+      <w:proofErr w:type="spellEnd"/>
+      <w:r>
+        <w:t>-topics --create --topic inventory-topic --bootstrap-server localhost:9092 --partitions 1 --replication-factor 1</w:t>
+      </w:r>
+    </w:p>
+    <w:p>
+      <w:pPr>
+        <w:pStyle w:val="NoSpacing"/>
+      </w:pPr>
+    </w:p>
+    <w:p>
+      <w:pPr>
+        <w:pStyle w:val="NoSpacing"/>
+      </w:pPr>
+      <w:r>
+        <w:t xml:space="preserve">docker exec -it </w:t>
+      </w:r>
+      <w:proofErr w:type="spellStart"/>
+      <w:r>
+        <w:t>kafka</w:t>
+      </w:r>
+      <w:proofErr w:type="spellEnd"/>
+      <w:r>
+        <w:t xml:space="preserve"> </w:t>
+      </w:r>
+      <w:proofErr w:type="spellStart"/>
+      <w:r>
+        <w:t>kafka</w:t>
+      </w:r>
+      <w:proofErr w:type="spellEnd"/>
+      <w:r>
+        <w:t>-topics --create --topic inventory-topic-</w:t>
+      </w:r>
+      <w:proofErr w:type="spellStart"/>
+      <w:r>
+        <w:t>dlt</w:t>
+      </w:r>
+      <w:proofErr w:type="spellEnd"/>
+      <w:r>
+        <w:t xml:space="preserve"> --bootstrap-server localhost:9092 --partitions 1 --replication-factor 1</w:t>
+      </w:r>
+    </w:p>
+    <w:p>
+      <w:pPr>
+        <w:pStyle w:val="NoSpacing"/>
+      </w:pPr>
+    </w:p>
+    <w:p>
+      <w:pPr>
+        <w:pStyle w:val="NoSpacing"/>
+      </w:pPr>
+      <w:r>
+        <w:t xml:space="preserve">docker exec -it </w:t>
+      </w:r>
+      <w:proofErr w:type="spellStart"/>
+      <w:r>
+        <w:t>kafka</w:t>
+      </w:r>
+      <w:proofErr w:type="spellEnd"/>
+      <w:r>
+        <w:t xml:space="preserve"> </w:t>
+      </w:r>
+      <w:proofErr w:type="spellStart"/>
+      <w:r>
+        <w:t>kafka</w:t>
+      </w:r>
+      <w:proofErr w:type="spellEnd"/>
+      <w:r>
+        <w:t>-topics --create --topic order-topic-</w:t>
+      </w:r>
+      <w:proofErr w:type="spellStart"/>
+      <w:r>
+        <w:t>dlt</w:t>
+      </w:r>
+      <w:proofErr w:type="spellEnd"/>
+      <w:r>
+        <w:t xml:space="preserve"> --bootstrap-server localhost:9092 --partitions 1 --replication-factor 1</w:t>
+      </w:r>
+    </w:p>
+    <w:p>
+      <w:pPr>
+        <w:pStyle w:val="NoSpacing"/>
+      </w:pPr>
+    </w:p>
+    <w:p>
+      <w:pPr>
+        <w:pStyle w:val="NoSpacing"/>
+      </w:pPr>
+      <w:r>
+        <w:t xml:space="preserve">docker exec -it </w:t>
+      </w:r>
+      <w:proofErr w:type="spellStart"/>
+      <w:r>
+        <w:t>kafka</w:t>
+      </w:r>
+      <w:proofErr w:type="spellEnd"/>
+      <w:r>
+        <w:t xml:space="preserve"> </w:t>
+      </w:r>
+      <w:proofErr w:type="spellStart"/>
+      <w:r>
+        <w:t>kafka</w:t>
+      </w:r>
+      <w:proofErr w:type="spellEnd"/>
+      <w:r>
+        <w:t>-consumer-groups --bootstrap-server localhost:9092 --group inventory-group --topic order-topic --reset-offsets --to-latest --execute</w:t>
+      </w:r>
+    </w:p>
+    <w:p>
+      <w:pPr>
+        <w:pStyle w:val="NoSpacing"/>
+      </w:pPr>
+    </w:p>
+    <w:p>
+      <w:pPr>
+        <w:pStyle w:val="NoSpacing"/>
+      </w:pPr>
+      <w:r>
+        <w:t xml:space="preserve">docker exec -it </w:t>
+      </w:r>
+      <w:proofErr w:type="spellStart"/>
+      <w:r>
+        <w:t>kafka</w:t>
+      </w:r>
+      <w:proofErr w:type="spellEnd"/>
+      <w:r>
+        <w:t xml:space="preserve"> </w:t>
+      </w:r>
+      <w:proofErr w:type="spellStart"/>
+      <w:r>
+        <w:t>kafka</w:t>
+      </w:r>
+      <w:proofErr w:type="spellEnd"/>
+      <w:r>
+        <w:t>-consumer-groups --bootstrap-server localhost:9092 --describe --group inventory-group</w:t>
+      </w:r>
+    </w:p>
+    <w:p>
+      <w:pPr>
+        <w:pStyle w:val="NoSpacing"/>
+      </w:pPr>
+    </w:p>
+    <w:p>
+      <w:pPr>
+        <w:pStyle w:val="NoSpacing"/>
+      </w:pPr>
+      <w:r>
+        <w:t xml:space="preserve">docker exec -it </w:t>
+      </w:r>
+      <w:proofErr w:type="spellStart"/>
+      <w:r>
+        <w:t>kafka</w:t>
+      </w:r>
+      <w:proofErr w:type="spellEnd"/>
+      <w:r>
+        <w:t xml:space="preserve"> </w:t>
+      </w:r>
+      <w:proofErr w:type="spellStart"/>
+      <w:r>
+        <w:t>kafka</w:t>
+      </w:r>
+      <w:proofErr w:type="spellEnd"/>
+      <w:r>
+        <w:t>-consumer-groups --bootstrap-server localhost:9092 --group inventory-group --topic order-topic --reset-offsets --to-latest --execute</w:t>
+      </w:r>
+    </w:p>
+    <w:p>
+      <w:pPr>
+        <w:pStyle w:val="NoSpacing"/>
+      </w:pPr>
+    </w:p>
+    <w:p>
+      <w:pPr>
+        <w:pStyle w:val="NoSpacing"/>
+      </w:pPr>
+    </w:p>
+    <w:p>
+      <w:pPr>
+        <w:pStyle w:val="NoSpacing"/>
+      </w:pPr>
+      <w:r>
+        <w:t xml:space="preserve">docker exec -it </w:t>
+      </w:r>
+      <w:proofErr w:type="spellStart"/>
+      <w:r>
+        <w:t>kafka</w:t>
+      </w:r>
+      <w:proofErr w:type="spellEnd"/>
+      <w:r>
+        <w:t xml:space="preserve"> </w:t>
+      </w:r>
+      <w:proofErr w:type="spellStart"/>
+      <w:r>
+        <w:t>kafka</w:t>
+      </w:r>
+      <w:proofErr w:type="spellEnd"/>
+      <w:r>
+        <w:t>-consumer-groups --bootstrap-server localhost:9092 --delete --group inventory-group</w:t>
+      </w:r>
+    </w:p>
+    <w:p>
+      <w:pPr>
+        <w:pStyle w:val="NoSpacing"/>
+      </w:pPr>
+    </w:p>
+    <w:p>
+      <w:pPr>
+        <w:pStyle w:val="NoSpacing"/>
+      </w:pPr>
+      <w:r>
+        <w:t xml:space="preserve">docker exec -it </w:t>
+      </w:r>
+      <w:proofErr w:type="spellStart"/>
+      <w:r>
+        <w:t>kafka</w:t>
+      </w:r>
+      <w:proofErr w:type="spellEnd"/>
+      <w:r>
+        <w:t xml:space="preserve"> </w:t>
+      </w:r>
+      <w:proofErr w:type="spellStart"/>
+      <w:r>
+        <w:t>kafka</w:t>
+      </w:r>
+      <w:proofErr w:type="spellEnd"/>
+      <w:r>
+        <w:t>-topics --describe --topic payment-topic --bootstrap-server localhost:9092</w:t>
       </w:r>
     </w:p>
     <w:p>
@@ -1281,79 +1944,159 @@
       </w:pPr>
       <w:r>
         <w:lastRenderedPageBreak/>
-        <w:t>docker exec -it kafka kafka-consumer-groups --bootstrap-server localhost:9092 --describe --group payment-group</w:t>
-      </w:r>
-    </w:p>
-    <w:p>
-      <w:pPr>
-        <w:pStyle w:val="NoSpacing"/>
-      </w:pPr>
-    </w:p>
-    <w:p>
-      <w:pPr>
-        <w:pStyle w:val="NoSpacing"/>
-      </w:pPr>
-      <w:r>
-        <w:t>docker exec -it kafka kafka-consumer-groups --bootstrap-server localhost:9092 --group order-group --topic payment-response-topic --reset-offsets --to-latest --execute</w:t>
-      </w:r>
-    </w:p>
-    <w:p>
-      <w:pPr>
-        <w:pStyle w:val="NoSpacing"/>
-      </w:pPr>
-    </w:p>
-    <w:p>
-      <w:pPr>
-        <w:pStyle w:val="NoSpacing"/>
-      </w:pPr>
-      <w:r>
-        <w:t>docker exec -it kafka kafka-consumer-groups --bootstrap-server localhost:9092 --group order-group --topic payment-response-topic --reset-offsets --to-latest --execute</w:t>
-      </w:r>
-    </w:p>
-    <w:p>
-      <w:pPr>
-        <w:pStyle w:val="NoSpacing"/>
-      </w:pPr>
-    </w:p>
-    <w:p>
-      <w:pPr>
-        <w:pStyle w:val="NoSpacing"/>
-      </w:pPr>
-    </w:p>
-    <w:p>
-      <w:pPr>
-        <w:pStyle w:val="NoSpacing"/>
-      </w:pPr>
-    </w:p>
-    <w:p>
-      <w:pPr>
-        <w:pStyle w:val="NoSpacing"/>
-      </w:pPr>
-      <w:r>
-        <w:t>docker run -d --name zookeeper  -p 2181:2181   -e ZOOKEEPER_CLIENT_PORT=2181   confluentinc/cp-zookeeper:7.5.0</w:t>
-      </w:r>
-    </w:p>
-    <w:p>
-      <w:pPr>
-        <w:pStyle w:val="NoSpacing"/>
-      </w:pPr>
-    </w:p>
-    <w:p>
-      <w:pPr>
-        <w:pStyle w:val="NoSpacing"/>
-      </w:pPr>
-    </w:p>
-    <w:p>
-      <w:pPr>
-        <w:pStyle w:val="NoSpacing"/>
-      </w:pPr>
-    </w:p>
-    <w:p>
-      <w:pPr>
-        <w:pStyle w:val="NoSpacing"/>
-      </w:pPr>
-      <w:r>
-        <w:t xml:space="preserve">docker exec -it kafka kafka-topics --delete --topic </w:t>
+        <w:t xml:space="preserve">docker exec -it </w:t>
+      </w:r>
+      <w:proofErr w:type="spellStart"/>
+      <w:r>
+        <w:t>kafka</w:t>
+      </w:r>
+      <w:proofErr w:type="spellEnd"/>
+      <w:r>
+        <w:t xml:space="preserve"> </w:t>
+      </w:r>
+      <w:proofErr w:type="spellStart"/>
+      <w:r>
+        <w:t>kafka</w:t>
+      </w:r>
+      <w:proofErr w:type="spellEnd"/>
+      <w:r>
+        <w:t>-consumer-groups --bootstrap-server localhost:9092 --describe --group payment-group</w:t>
+      </w:r>
+    </w:p>
+    <w:p>
+      <w:pPr>
+        <w:pStyle w:val="NoSpacing"/>
+      </w:pPr>
+    </w:p>
+    <w:p>
+      <w:pPr>
+        <w:pStyle w:val="NoSpacing"/>
+      </w:pPr>
+      <w:r>
+        <w:t xml:space="preserve">docker exec -it </w:t>
+      </w:r>
+      <w:proofErr w:type="spellStart"/>
+      <w:r>
+        <w:t>kafka</w:t>
+      </w:r>
+      <w:proofErr w:type="spellEnd"/>
+      <w:r>
+        <w:t xml:space="preserve"> </w:t>
+      </w:r>
+      <w:proofErr w:type="spellStart"/>
+      <w:r>
+        <w:t>kafka</w:t>
+      </w:r>
+      <w:proofErr w:type="spellEnd"/>
+      <w:r>
+        <w:t>-consumer-groups --bootstrap-server localhost:9092 --group order-group --topic payment-response-topic --reset-offsets --to-latest --execute</w:t>
+      </w:r>
+    </w:p>
+    <w:p>
+      <w:pPr>
+        <w:pStyle w:val="NoSpacing"/>
+      </w:pPr>
+    </w:p>
+    <w:p>
+      <w:pPr>
+        <w:pStyle w:val="NoSpacing"/>
+      </w:pPr>
+      <w:r>
+        <w:t xml:space="preserve">docker exec -it </w:t>
+      </w:r>
+      <w:proofErr w:type="spellStart"/>
+      <w:r>
+        <w:t>kafka</w:t>
+      </w:r>
+      <w:proofErr w:type="spellEnd"/>
+      <w:r>
+        <w:t xml:space="preserve"> </w:t>
+      </w:r>
+      <w:proofErr w:type="spellStart"/>
+      <w:r>
+        <w:t>kafka</w:t>
+      </w:r>
+      <w:proofErr w:type="spellEnd"/>
+      <w:r>
+        <w:t>-consumer-groups --bootstrap-server localhost:9092 --group order-group --topic payment-response-topic --reset-offsets --to-latest --execute</w:t>
+      </w:r>
+    </w:p>
+    <w:p>
+      <w:pPr>
+        <w:pStyle w:val="NoSpacing"/>
+      </w:pPr>
+    </w:p>
+    <w:p>
+      <w:pPr>
+        <w:pStyle w:val="NoSpacing"/>
+      </w:pPr>
+    </w:p>
+    <w:p>
+      <w:pPr>
+        <w:pStyle w:val="NoSpacing"/>
+      </w:pPr>
+    </w:p>
+    <w:p>
+      <w:pPr>
+        <w:pStyle w:val="NoSpacing"/>
+      </w:pPr>
+      <w:r>
+        <w:t xml:space="preserve">docker run -d --name </w:t>
+      </w:r>
+      <w:proofErr w:type="gramStart"/>
+      <w:r>
+        <w:t>zookeeper  -</w:t>
+      </w:r>
+      <w:proofErr w:type="gramEnd"/>
+      <w:r>
+        <w:t xml:space="preserve">p 2181:2181   -e ZOOKEEPER_CLIENT_PORT=2181   </w:t>
+      </w:r>
+      <w:proofErr w:type="spellStart"/>
+      <w:r>
+        <w:t>confluentinc</w:t>
+      </w:r>
+      <w:proofErr w:type="spellEnd"/>
+      <w:r>
+        <w:t>/cp-zookeeper:7.5.0</w:t>
+      </w:r>
+    </w:p>
+    <w:p>
+      <w:pPr>
+        <w:pStyle w:val="NoSpacing"/>
+      </w:pPr>
+    </w:p>
+    <w:p>
+      <w:pPr>
+        <w:pStyle w:val="NoSpacing"/>
+      </w:pPr>
+    </w:p>
+    <w:p>
+      <w:pPr>
+        <w:pStyle w:val="NoSpacing"/>
+      </w:pPr>
+    </w:p>
+    <w:p>
+      <w:pPr>
+        <w:pStyle w:val="NoSpacing"/>
+      </w:pPr>
+      <w:r>
+        <w:t xml:space="preserve">docker exec -it </w:t>
+      </w:r>
+      <w:proofErr w:type="spellStart"/>
+      <w:r>
+        <w:t>kafka</w:t>
+      </w:r>
+      <w:proofErr w:type="spellEnd"/>
+      <w:r>
+        <w:t xml:space="preserve"> </w:t>
+      </w:r>
+      <w:proofErr w:type="spellStart"/>
+      <w:r>
+        <w:t>kafka</w:t>
+      </w:r>
+      <w:proofErr w:type="spellEnd"/>
+      <w:r>
+        <w:t xml:space="preserve">-topics --delete --topic </w:t>
       </w:r>
       <w:r>
         <w:t>inventory-topic</w:t>
@@ -1370,56 +2113,235 @@
         <w:pStyle w:val="NoSpacing"/>
       </w:pPr>
       <w:r>
-        <w:t>docker exec -it kafka kafka-topics --delete --topic inventory-topic-dlt --bootstrap-server localhost:9092</w:t>
-      </w:r>
-    </w:p>
-    <w:p>
-      <w:pPr>
-        <w:pStyle w:val="NoSpacing"/>
-      </w:pPr>
-      <w:r>
-        <w:t>docker exec -it kafka kafka-topics --delete --topic order-topic --bootstrap-server localhost:9092</w:t>
-      </w:r>
-    </w:p>
-    <w:p>
-      <w:pPr>
-        <w:pStyle w:val="NoSpacing"/>
-      </w:pPr>
-      <w:r>
-        <w:t>docker exec -it kafka kafka-topics --delete --topic order-topic-dlt --bootstrap-server localhost:9092</w:t>
-      </w:r>
-    </w:p>
-    <w:p>
-      <w:pPr>
-        <w:pStyle w:val="NoSpacing"/>
-      </w:pPr>
-      <w:r>
-        <w:t>docker exec -it kafka kafka-topics --delete --topic order-topic-retry-0 --bootstrap-server localhost:9092</w:t>
-      </w:r>
-    </w:p>
-    <w:p>
-      <w:pPr>
-        <w:pStyle w:val="NoSpacing"/>
-      </w:pPr>
-      <w:r>
-        <w:t>docker exec -it kafka kafka-topics --delete --topic order-topic-retry-1 --bootstrap-server localhost:9092</w:t>
-      </w:r>
-    </w:p>
-    <w:p>
-      <w:pPr>
-        <w:pStyle w:val="NoSpacing"/>
-      </w:pPr>
-      <w:r>
-        <w:t>docker exec -it kafka kafka-topics --delete --topic payment-response-topic --bootstrap-server localhost:9092</w:t>
-      </w:r>
-    </w:p>
-    <w:p>
-      <w:pPr>
-        <w:pStyle w:val="NoSpacing"/>
-      </w:pPr>
-      <w:r>
-        <w:t>docker exec -it kafka kafka-topics --delete --topic product-topic --bootstrap-server localhost:9092</w:t>
-      </w:r>
+        <w:t xml:space="preserve">docker exec -it </w:t>
+      </w:r>
+      <w:proofErr w:type="spellStart"/>
+      <w:r>
+        <w:t>kafka</w:t>
+      </w:r>
+      <w:proofErr w:type="spellEnd"/>
+      <w:r>
+        <w:t xml:space="preserve"> </w:t>
+      </w:r>
+      <w:proofErr w:type="spellStart"/>
+      <w:r>
+        <w:t>kafka</w:t>
+      </w:r>
+      <w:proofErr w:type="spellEnd"/>
+      <w:r>
+        <w:t>-topics --delete --topic inventory-topic-</w:t>
+      </w:r>
+      <w:proofErr w:type="spellStart"/>
+      <w:r>
+        <w:t>dlt</w:t>
+      </w:r>
+      <w:proofErr w:type="spellEnd"/>
+      <w:r>
+        <w:t xml:space="preserve"> --bootstrap-server localhost:9092</w:t>
+      </w:r>
+    </w:p>
+    <w:p>
+      <w:pPr>
+        <w:pStyle w:val="NoSpacing"/>
+      </w:pPr>
+      <w:r>
+        <w:t xml:space="preserve">docker exec -it </w:t>
+      </w:r>
+      <w:proofErr w:type="spellStart"/>
+      <w:r>
+        <w:t>kafka</w:t>
+      </w:r>
+      <w:proofErr w:type="spellEnd"/>
+      <w:r>
+        <w:t xml:space="preserve"> </w:t>
+      </w:r>
+      <w:proofErr w:type="spellStart"/>
+      <w:r>
+        <w:t>kafka</w:t>
+      </w:r>
+      <w:proofErr w:type="spellEnd"/>
+      <w:r>
+        <w:t>-topics --delete --topic order-topic --bootstrap-server localhost:9092</w:t>
+      </w:r>
+    </w:p>
+    <w:p>
+      <w:pPr>
+        <w:pStyle w:val="NoSpacing"/>
+      </w:pPr>
+      <w:r>
+        <w:t xml:space="preserve">docker exec -it </w:t>
+      </w:r>
+      <w:proofErr w:type="spellStart"/>
+      <w:r>
+        <w:t>kafka</w:t>
+      </w:r>
+      <w:proofErr w:type="spellEnd"/>
+      <w:r>
+        <w:t xml:space="preserve"> </w:t>
+      </w:r>
+      <w:proofErr w:type="spellStart"/>
+      <w:r>
+        <w:t>kafka</w:t>
+      </w:r>
+      <w:proofErr w:type="spellEnd"/>
+      <w:r>
+        <w:t>-topics --delete --topic order-topic-</w:t>
+      </w:r>
+      <w:proofErr w:type="spellStart"/>
+      <w:r>
+        <w:t>dlt</w:t>
+      </w:r>
+      <w:proofErr w:type="spellEnd"/>
+      <w:r>
+        <w:t xml:space="preserve"> --bootstrap-server localhost:9092</w:t>
+      </w:r>
+    </w:p>
+    <w:p>
+      <w:pPr>
+        <w:pStyle w:val="NoSpacing"/>
+      </w:pPr>
+      <w:r>
+        <w:t xml:space="preserve">docker exec -it </w:t>
+      </w:r>
+      <w:proofErr w:type="spellStart"/>
+      <w:r>
+        <w:t>kafka</w:t>
+      </w:r>
+      <w:proofErr w:type="spellEnd"/>
+      <w:r>
+        <w:t xml:space="preserve"> </w:t>
+      </w:r>
+      <w:proofErr w:type="spellStart"/>
+      <w:r>
+        <w:t>kafka</w:t>
+      </w:r>
+      <w:proofErr w:type="spellEnd"/>
+      <w:r>
+        <w:t>-topics --delete --topic order-topic-retry-0 --bootstrap-server localhost:9092</w:t>
+      </w:r>
+    </w:p>
+    <w:p>
+      <w:pPr>
+        <w:pStyle w:val="NoSpacing"/>
+      </w:pPr>
+      <w:r>
+        <w:t xml:space="preserve">docker exec -it </w:t>
+      </w:r>
+      <w:proofErr w:type="spellStart"/>
+      <w:r>
+        <w:t>kafka</w:t>
+      </w:r>
+      <w:proofErr w:type="spellEnd"/>
+      <w:r>
+        <w:t xml:space="preserve"> </w:t>
+      </w:r>
+      <w:proofErr w:type="spellStart"/>
+      <w:r>
+        <w:t>kafka</w:t>
+      </w:r>
+      <w:proofErr w:type="spellEnd"/>
+      <w:r>
+        <w:t>-topics --delete --topic order-topic-retry-1 --bootstrap-server localhost:9092</w:t>
+      </w:r>
+    </w:p>
+    <w:p>
+      <w:pPr>
+        <w:pStyle w:val="NoSpacing"/>
+      </w:pPr>
+      <w:r>
+        <w:t xml:space="preserve">docker exec -it </w:t>
+      </w:r>
+      <w:proofErr w:type="spellStart"/>
+      <w:r>
+        <w:t>kafka</w:t>
+      </w:r>
+      <w:proofErr w:type="spellEnd"/>
+      <w:r>
+        <w:t xml:space="preserve"> </w:t>
+      </w:r>
+      <w:proofErr w:type="spellStart"/>
+      <w:r>
+        <w:t>kafka</w:t>
+      </w:r>
+      <w:proofErr w:type="spellEnd"/>
+      <w:r>
+        <w:t>-topics --delete --topic payment-response-topic --bootstrap-server localhost:9092</w:t>
+      </w:r>
+    </w:p>
+    <w:p>
+      <w:pPr>
+        <w:pStyle w:val="NoSpacing"/>
+      </w:pPr>
+      <w:r>
+        <w:t xml:space="preserve">docker exec -it </w:t>
+      </w:r>
+      <w:proofErr w:type="spellStart"/>
+      <w:r>
+        <w:t>kafka</w:t>
+      </w:r>
+      <w:proofErr w:type="spellEnd"/>
+      <w:r>
+        <w:t xml:space="preserve"> </w:t>
+      </w:r>
+      <w:proofErr w:type="spellStart"/>
+      <w:r>
+        <w:t>kafka</w:t>
+      </w:r>
+      <w:proofErr w:type="spellEnd"/>
+      <w:r>
+        <w:t>-topics --delete --topic product-topic --bootstrap-server localhost:9092</w:t>
+      </w:r>
+    </w:p>
+    <w:p>
+      <w:pPr>
+        <w:pStyle w:val="NoSpacing"/>
+      </w:pPr>
+    </w:p>
+    <w:p>
+      <w:pPr>
+        <w:pStyle w:val="NoSpacing"/>
+      </w:pPr>
+    </w:p>
+    <w:p>
+      <w:pPr>
+        <w:pStyle w:val="NoSpacing"/>
+        <w:rPr>
+          <w:b/>
+          <w:bCs/>
+        </w:rPr>
+      </w:pPr>
+      <w:r>
+        <w:rPr>
+          <w:b/>
+          <w:bCs/>
+        </w:rPr>
+        <w:t>docker compose down</w:t>
+      </w:r>
+    </w:p>
+    <w:p>
+      <w:pPr>
+        <w:pStyle w:val="NoSpacing"/>
+      </w:pPr>
+      <w:r>
+        <w:rPr>
+          <w:b/>
+          <w:bCs/>
+        </w:rPr>
+        <w:t>docker compose up --build</w:t>
+      </w:r>
+    </w:p>
+    <w:p>
+      <w:pPr>
+        <w:pStyle w:val="NoSpacing"/>
+      </w:pPr>
+      <w:r>
+        <w:t>docker compose restart</w:t>
+      </w:r>
+    </w:p>
+    <w:p>
+      <w:pPr>
+        <w:pStyle w:val="NoSpacing"/>
+      </w:pPr>
     </w:p>
     <w:p>
       <w:pPr>
@@ -1538,7 +2460,43 @@
           <w:b/>
           <w:bCs/>
         </w:rPr>
-        <w:t xml:space="preserve"> Why bootstrap.properties Instead of application.properties?</w:t>
+        <w:t xml:space="preserve"> Why </w:t>
+      </w:r>
+      <w:proofErr w:type="spellStart"/>
+      <w:proofErr w:type="gramStart"/>
+      <w:r>
+        <w:rPr>
+          <w:b/>
+          <w:bCs/>
+        </w:rPr>
+        <w:t>bootstrap.properties</w:t>
+      </w:r>
+      <w:proofErr w:type="spellEnd"/>
+      <w:proofErr w:type="gramEnd"/>
+      <w:r>
+        <w:rPr>
+          <w:b/>
+          <w:bCs/>
+        </w:rPr>
+        <w:t xml:space="preserve"> Instead of </w:t>
+      </w:r>
+      <w:proofErr w:type="spellStart"/>
+      <w:proofErr w:type="gramStart"/>
+      <w:r>
+        <w:rPr>
+          <w:b/>
+          <w:bCs/>
+        </w:rPr>
+        <w:t>application.properties</w:t>
+      </w:r>
+      <w:proofErr w:type="spellEnd"/>
+      <w:proofErr w:type="gramEnd"/>
+      <w:r>
+        <w:rPr>
+          <w:b/>
+          <w:bCs/>
+        </w:rPr>
+        <w:t>?</w:t>
       </w:r>
     </w:p>
     <w:p>
@@ -1592,7 +2550,6 @@
         <w:pStyle w:val="NoSpacing"/>
       </w:pPr>
       <w:r>
-        <w:lastRenderedPageBreak/>
         <w:t>Step 1 → It must connect to Config Server</w:t>
       </w:r>
       <w:r>
@@ -1623,8 +2580,15 @@
         <w:t>👉</w:t>
       </w:r>
       <w:r>
-        <w:t xml:space="preserve"> Spring must know WHERE Config Server is BEFORE loading application.properties</w:t>
-      </w:r>
+        <w:t xml:space="preserve"> Spring must know WHERE Config Server is BEFORE loading </w:t>
+      </w:r>
+      <w:proofErr w:type="spellStart"/>
+      <w:proofErr w:type="gramStart"/>
+      <w:r>
+        <w:t>application.properties</w:t>
+      </w:r>
+      <w:proofErr w:type="spellEnd"/>
+      <w:proofErr w:type="gramEnd"/>
     </w:p>
     <w:p>
       <w:pPr>
@@ -1642,28 +2606,50 @@
           <w:bCs/>
         </w:rPr>
       </w:pPr>
+      <w:proofErr w:type="spellStart"/>
+      <w:proofErr w:type="gramStart"/>
       <w:r>
         <w:rPr>
           <w:b/>
           <w:bCs/>
         </w:rPr>
-        <w:t>bootstrap.properties loads FIRST</w:t>
-      </w:r>
-    </w:p>
-    <w:p>
-      <w:pPr>
-        <w:pStyle w:val="NoSpacing"/>
+        <w:t>bootstrap.properties</w:t>
+      </w:r>
+      <w:proofErr w:type="spellEnd"/>
+      <w:proofErr w:type="gramEnd"/>
+      <w:r>
         <w:rPr>
           <w:b/>
           <w:bCs/>
         </w:rPr>
-      </w:pPr>
-      <w:r>
+        <w:t xml:space="preserve"> loads FIRST</w:t>
+      </w:r>
+    </w:p>
+    <w:p>
+      <w:pPr>
+        <w:pStyle w:val="NoSpacing"/>
         <w:rPr>
           <w:b/>
           <w:bCs/>
         </w:rPr>
-        <w:t>application.properties loads AFTER</w:t>
+      </w:pPr>
+      <w:proofErr w:type="spellStart"/>
+      <w:proofErr w:type="gramStart"/>
+      <w:r>
+        <w:rPr>
+          <w:b/>
+          <w:bCs/>
+        </w:rPr>
+        <w:t>application.properties</w:t>
+      </w:r>
+      <w:proofErr w:type="spellEnd"/>
+      <w:proofErr w:type="gramEnd"/>
+      <w:r>
+        <w:rPr>
+          <w:b/>
+          <w:bCs/>
+        </w:rPr>
+        <w:t xml:space="preserve"> loads AFTER</w:t>
       </w:r>
     </w:p>
     <w:p>
@@ -1692,7 +2678,25 @@
           <w:b/>
           <w:bCs/>
         </w:rPr>
-        <w:t xml:space="preserve"> When Do We Use bootstrap.properties?</w:t>
+        <w:t xml:space="preserve"> When Do We Use </w:t>
+      </w:r>
+      <w:proofErr w:type="spellStart"/>
+      <w:proofErr w:type="gramStart"/>
+      <w:r>
+        <w:rPr>
+          <w:b/>
+          <w:bCs/>
+        </w:rPr>
+        <w:t>bootstrap.properties</w:t>
+      </w:r>
+      <w:proofErr w:type="spellEnd"/>
+      <w:proofErr w:type="gramEnd"/>
+      <w:r>
+        <w:rPr>
+          <w:b/>
+          <w:bCs/>
+        </w:rPr>
+        <w:t>?</w:t>
       </w:r>
     </w:p>
     <w:p>
@@ -1793,7 +2797,27 @@
         <w:pStyle w:val="NoSpacing"/>
       </w:pPr>
       <w:r>
-        <w:t>Why bootstrap.properties instead of application.properties?</w:t>
+        <w:t xml:space="preserve">Why </w:t>
+      </w:r>
+      <w:proofErr w:type="spellStart"/>
+      <w:proofErr w:type="gramStart"/>
+      <w:r>
+        <w:t>bootstrap.properties</w:t>
+      </w:r>
+      <w:proofErr w:type="spellEnd"/>
+      <w:proofErr w:type="gramEnd"/>
+      <w:r>
+        <w:t xml:space="preserve"> instead of </w:t>
+      </w:r>
+      <w:proofErr w:type="spellStart"/>
+      <w:proofErr w:type="gramStart"/>
+      <w:r>
+        <w:t>application.properties</w:t>
+      </w:r>
+      <w:proofErr w:type="spellEnd"/>
+      <w:proofErr w:type="gramEnd"/>
+      <w:r>
+        <w:t>?</w:t>
       </w:r>
     </w:p>
     <w:p>
@@ -1859,7 +2883,20 @@
         <w:pStyle w:val="NoSpacing"/>
       </w:pPr>
       <w:r>
-        <w:t>Why is spring.config.import required?</w:t>
+        <w:t xml:space="preserve">Why is </w:t>
+      </w:r>
+      <w:proofErr w:type="spellStart"/>
+      <w:r>
+        <w:t>spring.</w:t>
+      </w:r>
+      <w:proofErr w:type="gramStart"/>
+      <w:r>
+        <w:t>config.import</w:t>
+      </w:r>
+      <w:proofErr w:type="spellEnd"/>
+      <w:proofErr w:type="gramEnd"/>
+      <w:r>
+        <w:t xml:space="preserve"> required?</w:t>
       </w:r>
     </w:p>
     <w:p>
@@ -1875,7 +2912,20 @@
         <w:pStyle w:val="NoSpacing"/>
       </w:pPr>
       <w:r>
-        <w:t>Starting Spring Boot 2.4, the bootstrap phase was removed by default, so external config locations must be explicitly defined using spring.config.import.</w:t>
+        <w:t xml:space="preserve">Starting Spring Boot 2.4, the bootstrap phase was removed by default, so external config locations must be explicitly defined using </w:t>
+      </w:r>
+      <w:proofErr w:type="spellStart"/>
+      <w:r>
+        <w:t>spring.</w:t>
+      </w:r>
+      <w:proofErr w:type="gramStart"/>
+      <w:r>
+        <w:t>config.import</w:t>
+      </w:r>
+      <w:proofErr w:type="spellEnd"/>
+      <w:proofErr w:type="gramEnd"/>
+      <w:r>
+        <w:t>.</w:t>
       </w:r>
     </w:p>
     <w:p>
@@ -1983,6 +3033,7 @@
         <w:pStyle w:val="NoSpacing"/>
       </w:pPr>
       <w:r>
+        <w:lastRenderedPageBreak/>
         <w:t>4️</w:t>
       </w:r>
       <w:r>

</xml_diff>